<commit_message>
﻿User Guide 3.3 as accepted, and 3.2 archived
Glen opened 3.3 and accepted every tracked change, so the file in the tree is
his: zero revisions, the three new figures present, captions running 1 to 8.
Committed as it stands rather than reverting to the marked-up version.

3.2 is now superseded, so it moves to Documents\.Archive, and 3.3 is published
to the Dropbox Sangala Mosaic Files folder with the prior version archived
beside it. Hashes compared after the copy.
</commit_message>
<xml_diff>
--- a/Documents/User Guide (Ver 3.3).docx
+++ b/Documents/User Guide (Ver 3.3).docx
@@ -1214,7 +1214,7 @@
       <w:pPr>
         <w:sectPr>
           <w:footerReference w:type="default" r:id="rId8"/>
-          <w:footerReference w:type="first" r:id="rId17"/>
+          <w:footerReference w:type="first" r:id="rId9"/>
           <w:pgSz w:w="12240" w:h="15840"/>
           <w:pgMar w:top="1440" w:right="1530" w:bottom="1440" w:left="1440" w:header="720" w:footer="720" w:gutter="0"/>
           <w:pgNumType w:fmt="lowerRoman" w:start="1"/>
@@ -1495,748 +1495,16 @@
         <w:keepNext/>
         <w:spacing w:before="120"/>
         <w:jc w:val="center"/>
-        <w:rPr>
-          <w:ins w:id="3500" w:author="Figures" w:date="2026-08-10T00:00:00Z"/>
-        </w:rPr>
-      </w:pPr>
-      <w:ins w:id="3000" w:author="Figures" w:date="2026-08-10T00:00:00Z">
-        <w:r>
-          <w:rPr>
-            <w:noProof/>
-          </w:rPr>
-          <w:drawing>
-            <wp:inline distT="0" distB="0" distL="0" distR="0">
-              <wp:extent cx="5486400" cy="2999232"/>
-              <wp:effectExtent l="0" t="0" r="0" b="0"/>
-              <wp:docPr id="2000" name="Figure2000"/>
-              <wp:cNvGraphicFramePr>
-                <a:graphicFrameLocks xmlns:a="http://schemas.openxmlformats.org/drawingml/2006/main" noChangeAspect="1"/>
-              </wp:cNvGraphicFramePr>
-              <a:graphic xmlns:a="http://schemas.openxmlformats.org/drawingml/2006/main">
-                <a:graphicData uri="http://schemas.openxmlformats.org/drawingml/2006/picture">
-                  <pic:pic xmlns:pic="http://schemas.openxmlformats.org/drawingml/2006/picture">
-                    <pic:nvPicPr>
-                      <pic:cNvPr id="2000" name="Figure2000.png"/>
-                      <pic:cNvPicPr/>
-                    </pic:nvPicPr>
-                    <pic:blipFill>
-                      <a:blip r:embed="rId18"/>
-                      <a:stretch>
-                        <a:fillRect/>
-                      </a:stretch>
-                    </pic:blipFill>
-                    <pic:spPr>
-                      <a:xfrm>
-                        <a:off x="0" y="0"/>
-                        <a:ext cx="5486400" cy="2999232"/>
-                      </a:xfrm>
-                      <a:prstGeom prst="rect">
-                        <a:avLst/>
-                      </a:prstGeom>
-                    </pic:spPr>
-                  </pic:pic>
-                </a:graphicData>
-              </a:graphic>
-            </wp:inline>
-          </w:drawing>
-        </w:r>
-      </w:ins>
-    </w:p>
-    <w:p>
-      <w:pPr>
-        <w:spacing w:before="60" w:after="120"/>
-        <w:jc w:val="center"/>
-        <w:rPr>
-          <w:ins w:id="3505" w:author="Figures" w:date="2026-08-10T00:00:00Z"/>
-        </w:rPr>
-      </w:pPr>
-      <w:ins w:id="3005" w:author="Figures" w:date="2026-08-10T00:00:00Z">
-        <w:r>
-          <w:rPr>
-            <w:i/>
-            <w:iCs/>
-          </w:rPr>
-          <w:t xml:space="preserve">Figure 1. The four regions of the screen: the menu bar, the tools, the workspace, and the build panel.</w:t>
-        </w:r>
-      </w:ins>
-    </w:p>
-    <w:p>
-      <w:pPr>
-        <w:pStyle w:val="Heading2"/>
-        <w:rPr>
-          <w:rFonts w:eastAsia="Times New Roman"/>
-        </w:rPr>
-      </w:pPr>
-      <w:bookmarkStart w:id="1" w:name="_Toc236986549"/>
-      <w:r>
-        <w:rPr>
-          <w:rFonts w:eastAsia="Times New Roman"/>
-        </w:rPr>
-        <w:t>2. The palette</w:t>
-      </w:r>
-      <w:bookmarkEnd w:id="1"/>
-    </w:p>
-    <w:p>
-      <w:pPr>
-        <w:pStyle w:val="NormalWeb"/>
-        <w:spacing w:before="0" w:beforeAutospacing="0" w:after="60" w:afterAutospacing="0"/>
-      </w:pPr>
-      <w:r>
-        <w:t>The mosaic is built from the colors in the palette; the tile list counts how many of each the design uses.</w:t>
-      </w:r>
-    </w:p>
-    <w:p>
-      <w:pPr>
-        <w:pStyle w:val="ListParagraph"/>
-        <w:numPr>
-          <w:ilvl w:val="0"/>
-          <w:numId w:val="19"/>
-        </w:numPr>
-        <w:spacing w:after="60"/>
-        <w:contextualSpacing w:val="0"/>
-        <w:rPr>
-          <w:rFonts w:eastAsia="Times New Roman"/>
-        </w:rPr>
-      </w:pPr>
-      <w:r>
-        <w:rPr>
-          <w:rStyle w:val="Strong"/>
-          <w:rFonts w:eastAsia="Times New Roman"/>
-        </w:rPr>
-        <w:t>The palette drives the mosaic.</w:t>
-      </w:r>
-      <w:r>
-        <w:t xml:space="preserve"> Down the right side is the </w:t>
-      </w:r>
-      <w:r>
-        <w:rPr>
-          <w:i/>
-          <w:iCs/>
-        </w:rPr>
-        <w:t>Palette</w:t>
-      </w:r>
-      <w:r>
-        <w:t xml:space="preserve"> — real LEGO tile colors, including several grays from very light to dark, so a mostly-gray subject still shows its shading. The mosaic uses only these colors. To change them, press </w:t>
-      </w:r>
-      <w:r>
-        <w:rPr>
-          <w:i/>
-          <w:iCs/>
-        </w:rPr>
-        <w:t>Tile Colors</w:t>
-      </w:r>
-      <w:r>
-        <w:t xml:space="preserve"> and then </w:t>
-      </w:r>
-      <w:r>
-        <w:rPr>
-          <w:i/>
-          <w:iCs/>
-        </w:rPr>
-        <w:t>Edit</w:t>
-      </w:r>
-      <w:r>
-        <w:t xml:space="preserve">: click a color to turn it </w:t>
-      </w:r>
-      <w:r>
-        <w:rPr>
-          <w:rStyle w:val="Strong"/>
-          <w:rFonts w:eastAsia="Times New Roman"/>
-        </w:rPr>
-        <w:t>off</w:t>
-      </w:r>
-      <w:r>
-        <w:t xml:space="preserve"> or back </w:t>
-      </w:r>
-      <w:r>
-        <w:rPr>
-          <w:rStyle w:val="Strong"/>
-          <w:rFonts w:eastAsia="Times New Roman"/>
-        </w:rPr>
-        <w:t>on</w:t>
-      </w:r>
-      <w:r>
-        <w:t xml:space="preserve">. </w:t>
-      </w:r>
-      <w:r>
-        <w:rPr>
-          <w:i/>
-          <w:iCs/>
-        </w:rPr>
-        <w:t>Clear</w:t>
-      </w:r>
-      <w:r>
-        <w:t xml:space="preserve"> empties the palette so you can add just the colors you want; </w:t>
-      </w:r>
-      <w:r>
-        <w:rPr>
-          <w:i/>
-          <w:iCs/>
-        </w:rPr>
-        <w:t>Reset</w:t>
-      </w:r>
-      <w:r>
-        <w:t xml:space="preserve"> brings back the standard set.</w:t>
-      </w:r>
-    </w:p>
-    <w:p>
-      <w:pPr>
-        <w:pStyle w:val="ListParagraph"/>
-        <w:numPr>
-          <w:ilvl w:val="0"/>
-          <w:numId w:val="19"/>
-        </w:numPr>
-        <w:spacing w:after="60"/>
-        <w:contextualSpacing w:val="0"/>
-        <w:rPr>
-          <w:rFonts w:eastAsia="Times New Roman"/>
-        </w:rPr>
-      </w:pPr>
-      <w:r>
-        <w:rPr>
-          <w:rStyle w:val="Strong"/>
-          <w:rFonts w:eastAsia="Times New Roman"/>
-        </w:rPr>
-        <w:t>The None swatch.</w:t>
-      </w:r>
-      <w:r>
-        <w:t xml:space="preserve"> First in the palette, a red ✕ — not a color but “no tile.” With tiles or a part selected, clicking it empties them (one undo step); in a painting tool it switches to </w:t>
-      </w:r>
-      <w:r>
-        <w:rPr>
-          <w:i/>
-          <w:iCs/>
-        </w:rPr>
-        <w:t>Erase</w:t>
-      </w:r>
-      <w:r>
-        <w:t xml:space="preserve">. It is hidden inside </w:t>
-      </w:r>
-      <w:r>
-        <w:rPr>
-          <w:i/>
-          <w:iCs/>
-        </w:rPr>
-        <w:t>Edit</w:t>
-      </w:r>
-      <w:r>
-        <w:t>, where none is not a color.</w:t>
-      </w:r>
-    </w:p>
-    <w:p>
-      <w:pPr>
-        <w:pStyle w:val="ListParagraph"/>
-        <w:numPr>
-          <w:ilvl w:val="0"/>
-          <w:numId w:val="19"/>
-        </w:numPr>
-        <w:spacing w:after="60"/>
-        <w:contextualSpacing w:val="0"/>
-        <w:rPr>
-          <w:rFonts w:eastAsia="Times New Roman"/>
-        </w:rPr>
-      </w:pPr>
-      <w:r>
-        <w:rPr>
-          <w:rStyle w:val="Strong"/>
-          <w:rFonts w:eastAsia="Times New Roman"/>
-        </w:rPr>
-        <w:t>Add colors from a photo.</w:t>
-      </w:r>
-      <w:r>
-        <w:t xml:space="preserve"> </w:t>
-      </w:r>
-      <w:r>
-        <w:rPr>
-          <w:i/>
-          <w:iCs/>
-        </w:rPr>
-        <w:t>Add Tile Colors in a Photo</w:t>
-      </w:r>
-      <w:r>
-        <w:t xml:space="preserve"> (under </w:t>
-      </w:r>
-      <w:r>
-        <w:rPr>
-          <w:i/>
-          <w:iCs/>
-        </w:rPr>
-        <w:t>Tile Colors</w:t>
-      </w:r>
-      <w:r>
-        <w:t xml:space="preserve">) reads the LEGO colors out of a photo in the workspace — loose tiles, a tray of them, or a mosaic already built — and adds them to the palette as </w:t>
-      </w:r>
-      <w:r>
-        <w:rPr>
-          <w:i/>
-          <w:iCs/>
-        </w:rPr>
-        <w:t>Custom Tiles</w:t>
-      </w:r>
-      <w:r>
-        <w:t xml:space="preserve">, kept beside the </w:t>
-      </w:r>
-      <w:r>
-        <w:rPr>
-          <w:i/>
-          <w:iCs/>
-        </w:rPr>
-        <w:t>Standard Tiles</w:t>
-      </w:r>
-      <w:r>
-        <w:t>.</w:t>
-      </w:r>
-    </w:p>
-    <w:p>
-      <w:pPr>
-        <w:pStyle w:val="ListParagraph"/>
-        <w:numPr>
-          <w:ilvl w:val="0"/>
-          <w:numId w:val="19"/>
-        </w:numPr>
-        <w:spacing w:after="60"/>
-        <w:contextualSpacing w:val="0"/>
-        <w:rPr>
-          <w:rFonts w:eastAsia="Times New Roman"/>
-        </w:rPr>
-      </w:pPr>
-      <w:r>
-        <w:rPr>
-          <w:rStyle w:val="Strong"/>
-          <w:rFonts w:eastAsia="Times New Roman"/>
-        </w:rPr>
-        <w:t>The tile list counts every color.</w:t>
-      </w:r>
-      <w:r>
-        <w:t xml:space="preserve"> After you build, the status line totals them, and </w:t>
-      </w:r>
-      <w:r>
-        <w:rPr>
-          <w:i/>
-          <w:iCs/>
-        </w:rPr>
-        <w:t>Save</w:t>
-      </w:r>
-      <w:r>
-        <w:t xml:space="preserve"> → </w:t>
-      </w:r>
-      <w:r>
-        <w:rPr>
-          <w:i/>
-          <w:iCs/>
-        </w:rPr>
-        <w:t>Tile List</w:t>
-      </w:r>
-      <w:r>
-        <w:t xml:space="preserve"> writes every color with its count — “47 dark gray, 23 white, 8 red…” — the list to order from or build against. The printed sheet carries the same counts beneath the picture.</w:t>
-      </w:r>
-    </w:p>
-    <w:p>
-      <w:pPr>
-        <w:keepNext/>
-        <w:spacing w:before="120"/>
-        <w:jc w:val="center"/>
-        <w:rPr>
-          <w:ins w:id="3510" w:author="Figures" w:date="2026-08-10T00:00:00Z"/>
-        </w:rPr>
-      </w:pPr>
-      <w:ins w:id="3010" w:author="Figures" w:date="2026-08-10T00:00:00Z">
-        <w:r>
-          <w:rPr>
-            <w:noProof/>
-          </w:rPr>
-          <w:drawing>
-            <wp:inline distT="0" distB="0" distL="0" distR="0">
-              <wp:extent cx="2468880" cy="2409626"/>
-              <wp:effectExtent l="0" t="0" r="0" b="0"/>
-              <wp:docPr id="2001" name="Figure2001"/>
-              <wp:cNvGraphicFramePr>
-                <a:graphicFrameLocks xmlns:a="http://schemas.openxmlformats.org/drawingml/2006/main" noChangeAspect="1"/>
-              </wp:cNvGraphicFramePr>
-              <a:graphic xmlns:a="http://schemas.openxmlformats.org/drawingml/2006/main">
-                <a:graphicData uri="http://schemas.openxmlformats.org/drawingml/2006/picture">
-                  <pic:pic xmlns:pic="http://schemas.openxmlformats.org/drawingml/2006/picture">
-                    <pic:nvPicPr>
-                      <pic:cNvPr id="2001" name="Figure2001.png"/>
-                      <pic:cNvPicPr/>
-                    </pic:nvPicPr>
-                    <pic:blipFill>
-                      <a:blip r:embed="rId19"/>
-                      <a:stretch>
-                        <a:fillRect/>
-                      </a:stretch>
-                    </pic:blipFill>
-                    <pic:spPr>
-                      <a:xfrm>
-                        <a:off x="0" y="0"/>
-                        <a:ext cx="2468880" cy="2409626"/>
-                      </a:xfrm>
-                      <a:prstGeom prst="rect">
-                        <a:avLst/>
-                      </a:prstGeom>
-                    </pic:spPr>
-                  </pic:pic>
-                </a:graphicData>
-              </a:graphic>
-            </wp:inline>
-          </w:drawing>
-        </w:r>
-      </w:ins>
-    </w:p>
-    <w:p>
-      <w:pPr>
-        <w:spacing w:before="60" w:after="120"/>
-        <w:jc w:val="center"/>
-        <w:rPr>
-          <w:ins w:id="3515" w:author="Figures" w:date="2026-08-10T00:00:00Z"/>
-        </w:rPr>
-      </w:pPr>
-      <w:ins w:id="3015" w:author="Figures" w:date="2026-08-10T00:00:00Z">
-        <w:r>
-          <w:rPr>
-            <w:i/>
-            <w:iCs/>
-          </w:rPr>
-          <w:t xml:space="preserve">Figure 2. The palette, with Tile Colors open for editing.</w:t>
-        </w:r>
-      </w:ins>
-    </w:p>
-    <w:p>
-      <w:pPr>
-        <w:pStyle w:val="Heading2"/>
-        <w:rPr>
-          <w:rFonts w:eastAsia="Times New Roman"/>
-        </w:rPr>
-      </w:pPr>
-      <w:bookmarkStart w:id="2" w:name="_Toc236986550"/>
-      <w:r>
-        <w:rPr>
-          <w:rFonts w:eastAsia="Times New Roman"/>
-        </w:rPr>
-        <w:t>3. Open a photo (and build a scene)</w:t>
-      </w:r>
-      <w:bookmarkEnd w:id="2"/>
-    </w:p>
-    <w:p>
-      <w:pPr>
-        <w:pStyle w:val="ListParagraph"/>
-        <w:numPr>
-          <w:ilvl w:val="0"/>
-          <w:numId w:val="20"/>
-        </w:numPr>
-        <w:spacing w:after="60"/>
-        <w:contextualSpacing w:val="0"/>
-        <w:rPr>
-          <w:rFonts w:eastAsia="Times New Roman"/>
-        </w:rPr>
-      </w:pPr>
-      <w:r>
-        <w:t xml:space="preserve">Click </w:t>
-      </w:r>
-      <w:r>
-        <w:rPr>
-          <w:rStyle w:val="Strong"/>
-          <w:rFonts w:eastAsia="Times New Roman"/>
-        </w:rPr>
-        <w:t>Open</w:t>
-      </w:r>
-      <w:r>
-        <w:t xml:space="preserve"> (or drag a picture onto the workspace). Sangala accepts </w:t>
-      </w:r>
-      <w:r>
-        <w:rPr>
-          <w:rStyle w:val="Strong"/>
-          <w:rFonts w:eastAsia="Times New Roman"/>
-        </w:rPr>
-        <w:t>.png</w:t>
-      </w:r>
-      <w:r>
-        <w:t xml:space="preserve"> and </w:t>
-      </w:r>
-      <w:r>
-        <w:rPr>
-          <w:rStyle w:val="Strong"/>
-          <w:rFonts w:eastAsia="Times New Roman"/>
-        </w:rPr>
-        <w:t>.jpg</w:t>
-      </w:r>
-      <w:r>
-        <w:t>.</w:t>
-      </w:r>
-    </w:p>
-    <w:p>
-      <w:pPr>
-        <w:pStyle w:val="ListParagraph"/>
-        <w:numPr>
-          <w:ilvl w:val="0"/>
-          <w:numId w:val="20"/>
-        </w:numPr>
-        <w:spacing w:after="60"/>
-        <w:contextualSpacing w:val="0"/>
-        <w:rPr>
-          <w:rFonts w:eastAsia="Times New Roman"/>
-        </w:rPr>
-      </w:pPr>
-      <w:r>
-        <w:t xml:space="preserve">The photo drops onto the workspace at a comfortable size. </w:t>
-      </w:r>
-      <w:r>
-        <w:rPr>
-          <w:i/>
-          <w:iCs/>
-        </w:rPr>
-        <w:t>Drag its body</w:t>
-      </w:r>
-      <w:r>
-        <w:t xml:space="preserve"> to move it; </w:t>
-      </w:r>
-      <w:r>
-        <w:rPr>
-          <w:i/>
-          <w:iCs/>
-        </w:rPr>
-        <w:t>drag a corner handle</w:t>
-      </w:r>
-      <w:r>
-        <w:t xml:space="preserve"> to resize it (the shape is kept, so it never stretches). Press </w:t>
-      </w:r>
-      <w:r>
-        <w:rPr>
-          <w:i/>
-          <w:iCs/>
-        </w:rPr>
-        <w:t>Delete</w:t>
-      </w:r>
-      <w:r>
-        <w:t xml:space="preserve"> to remove a selected photo.</w:t>
-      </w:r>
-    </w:p>
-    <w:p>
-      <w:pPr>
-        <w:pStyle w:val="ListParagraph"/>
-        <w:numPr>
-          <w:ilvl w:val="0"/>
-          <w:numId w:val="20"/>
-        </w:numPr>
-        <w:spacing w:after="60"/>
-        <w:contextualSpacing w:val="0"/>
-        <w:rPr>
-          <w:rFonts w:eastAsia="Times New Roman"/>
-        </w:rPr>
-      </w:pPr>
-      <w:r>
-        <w:rPr>
-          <w:i/>
-          <w:iCs/>
-        </w:rPr>
-        <w:t>Open again to add another picture.</w:t>
-      </w:r>
-      <w:r>
-        <w:t xml:space="preserve"> Each </w:t>
-      </w:r>
-      <w:r>
-        <w:rPr>
-          <w:rStyle w:val="Strong"/>
-          <w:rFonts w:eastAsia="Times New Roman"/>
-        </w:rPr>
-        <w:t>Open</w:t>
-      </w:r>
-      <w:r>
-        <w:t xml:space="preserve"> adds a layer, so you can build a scene — a background behind, a subject in front — and turn the whole composite into one mosaic.</w:t>
-      </w:r>
-    </w:p>
-    <w:p>
-      <w:pPr>
-        <w:pStyle w:val="NormalWeb"/>
-        <w:spacing w:beforeAutospacing="0" w:afterAutospacing="0"/>
-      </w:pPr>
-      <w:r>
-        <w:rPr>
-          <w:i/>
-          <w:iCs/>
-        </w:rPr>
-        <w:t>Layer order (which picture is in front).</w:t>
-      </w:r>
-      <w:r>
-        <w:t xml:space="preserve"> Select a picture to open its panel on the right, then use the layer controls there to send it forward or back, so the foreground animal sits on top of the background.</w:t>
-      </w:r>
-    </w:p>
-    <w:p>
-      <w:pPr>
-        <w:pStyle w:val="Heading2"/>
-        <w:rPr>
-          <w:rFonts w:eastAsia="Times New Roman"/>
-        </w:rPr>
-      </w:pPr>
-      <w:bookmarkStart w:id="3" w:name="_Toc236986551"/>
-      <w:r>
-        <w:rPr>
-          <w:rFonts w:eastAsia="Times New Roman"/>
-        </w:rPr>
-        <w:lastRenderedPageBreak/>
-        <w:t>4. Remove the background</w:t>
-      </w:r>
-      <w:bookmarkEnd w:id="3"/>
-    </w:p>
-    <w:p>
-      <w:pPr>
-        <w:pStyle w:val="NormalWeb"/>
-        <w:spacing w:before="0" w:beforeAutospacing="0" w:after="60" w:afterAutospacing="0"/>
-      </w:pPr>
-      <w:r>
-        <w:t>Remove Background clears the backdrop from a picture so that only the subject becomes tiles:</w:t>
-      </w:r>
-    </w:p>
-    <w:p>
-      <w:pPr>
-        <w:pStyle w:val="ListParagraph"/>
-        <w:numPr>
-          <w:ilvl w:val="0"/>
-          <w:numId w:val="20"/>
-        </w:numPr>
-        <w:spacing w:after="60"/>
-        <w:contextualSpacing w:val="0"/>
-        <w:rPr>
-          <w:rFonts w:eastAsia="Times New Roman"/>
-        </w:rPr>
-      </w:pPr>
-      <w:r>
-        <w:t>Select the picture.</w:t>
-      </w:r>
-    </w:p>
-    <w:p>
-      <w:pPr>
-        <w:pStyle w:val="ListParagraph"/>
-        <w:numPr>
-          <w:ilvl w:val="0"/>
-          <w:numId w:val="20"/>
-        </w:numPr>
-        <w:spacing w:after="60"/>
-        <w:contextualSpacing w:val="0"/>
-        <w:rPr>
-          <w:rFonts w:eastAsia="Times New Roman"/>
-        </w:rPr>
-      </w:pPr>
-      <w:r>
-        <w:t xml:space="preserve">In its panel, turn on </w:t>
-      </w:r>
-      <w:r>
-        <w:rPr>
-          <w:rStyle w:val="Strong"/>
-          <w:rFonts w:eastAsia="Times New Roman"/>
-        </w:rPr>
-        <w:t>Remove Background</w:t>
-      </w:r>
-      <w:r>
-        <w:t>. Sangala clears the backdrop from the edges inward and leaves the subject — keeping interior whites (a crane's white belly stays; only the true background goes).</w:t>
-      </w:r>
-    </w:p>
-    <w:p>
-      <w:pPr>
-        <w:pStyle w:val="ListParagraph"/>
-        <w:numPr>
-          <w:ilvl w:val="0"/>
-          <w:numId w:val="20"/>
-        </w:numPr>
-        <w:spacing w:after="60"/>
-        <w:contextualSpacing w:val="0"/>
-        <w:rPr>
-          <w:rFonts w:eastAsia="Times New Roman"/>
-        </w:rPr>
-      </w:pPr>
-      <w:r>
-        <w:t xml:space="preserve">The original is never lost. Turn </w:t>
-      </w:r>
-      <w:r>
-        <w:rPr>
-          <w:rStyle w:val="Strong"/>
-          <w:rFonts w:eastAsia="Times New Roman"/>
-        </w:rPr>
-        <w:t>Remove Background</w:t>
-      </w:r>
-      <w:r>
-        <w:t xml:space="preserve"> off to bring the backdrop back.</w:t>
-      </w:r>
-    </w:p>
-    <w:p>
-      <w:pPr>
-        <w:pStyle w:val="NormalWeb"/>
-        <w:spacing w:beforeAutospacing="0" w:afterAutospacing="0"/>
-      </w:pPr>
-      <w:r>
-        <w:t xml:space="preserve">With the background removed, the empty area around the subject becomes </w:t>
-      </w:r>
-      <w:r>
-        <w:rPr>
-          <w:rStyle w:val="Strong"/>
-          <w:rFonts w:eastAsia="Times New Roman"/>
-        </w:rPr>
-        <w:t>empty cells</w:t>
-      </w:r>
-      <w:r>
-        <w:t xml:space="preserve"> in the mosaic (or bare baseplate), not tiles.</w:t>
-      </w:r>
-    </w:p>
-    <w:p>
-      <w:pPr>
-        <w:pStyle w:val="Heading2"/>
-        <w:rPr>
-          <w:rFonts w:eastAsia="Times New Roman"/>
-        </w:rPr>
-      </w:pPr>
-      <w:bookmarkStart w:id="4" w:name="_Toc236986552"/>
-      <w:r>
-        <w:rPr>
-          <w:rFonts w:eastAsia="Times New Roman"/>
-        </w:rPr>
-        <w:t>5. The grid — framing the mosaic</w:t>
-      </w:r>
-      <w:bookmarkEnd w:id="4"/>
-    </w:p>
-    <w:p>
-      <w:pPr>
-        <w:pStyle w:val="NormalWeb"/>
-        <w:spacing w:before="0" w:beforeAutospacing="0" w:after="60" w:afterAutospacing="0"/>
-      </w:pPr>
-      <w:r>
-        <w:t xml:space="preserve">The </w:t>
-      </w:r>
-      <w:r>
-        <w:rPr>
-          <w:rStyle w:val="Strong"/>
-          <w:rFonts w:eastAsia="Times New Roman"/>
-        </w:rPr>
-        <w:t>grid frame</w:t>
-      </w:r>
-      <w:r>
-        <w:t xml:space="preserve"> is the box on the workspace that decides what becomes the mosaic and how fine it is. Whatever falls </w:t>
-      </w:r>
-      <w:r>
-        <w:rPr>
-          <w:rStyle w:val="Strong"/>
-          <w:rFonts w:eastAsia="Times New Roman"/>
-        </w:rPr>
-        <w:t>inside</w:t>
-      </w:r>
-      <w:r>
-        <w:t xml:space="preserve"> the frame is what gets built.</w:t>
-      </w:r>
-    </w:p>
-    <w:p>
-      <w:pPr>
-        <w:keepNext/>
-        <w:spacing w:before="120"/>
-        <w:jc w:val="center"/>
       </w:pPr>
       <w:r>
         <w:rPr>
           <w:noProof/>
         </w:rPr>
         <w:drawing>
-          <wp:inline distT="0" distB="0" distL="0" distR="0" wp14:anchorId="41455620" wp14:editId="1C05D468">
-            <wp:extent cx="3017520" cy="2984464"/>
+          <wp:inline distT="0" distB="0" distL="0" distR="0" wp14:anchorId="59628CA9" wp14:editId="34BB0B55">
+            <wp:extent cx="5486400" cy="2999232"/>
             <wp:effectExtent l="0" t="0" r="0" b="0"/>
-            <wp:docPr id="1001" name="Figure1"/>
+            <wp:docPr id="2000" name="Figure2000"/>
             <wp:cNvGraphicFramePr>
               <a:graphicFrameLocks xmlns:a="http://schemas.openxmlformats.org/drawingml/2006/main" noChangeAspect="1"/>
             </wp:cNvGraphicFramePr>
@@ -2244,306 +1512,7 @@
               <a:graphicData uri="http://schemas.openxmlformats.org/drawingml/2006/picture">
                 <pic:pic xmlns:pic="http://schemas.openxmlformats.org/drawingml/2006/picture">
                   <pic:nvPicPr>
-                    <pic:cNvPr id="1001" name="Figure1.png"/>
-                    <pic:cNvPicPr/>
-                  </pic:nvPicPr>
-                  <pic:blipFill>
-                    <a:blip r:embed="rId9"/>
-                    <a:stretch>
-                      <a:fillRect/>
-                    </a:stretch>
-                  </pic:blipFill>
-                  <pic:spPr>
-                    <a:xfrm>
-                      <a:off x="0" y="0"/>
-                      <a:ext cx="3017520" cy="2984464"/>
-                    </a:xfrm>
-                    <a:prstGeom prst="rect">
-                      <a:avLst/>
-                    </a:prstGeom>
-                  </pic:spPr>
-                </pic:pic>
-              </a:graphicData>
-            </a:graphic>
-          </wp:inline>
-        </w:drawing>
-      </w:r>
-    </w:p>
-    <w:p>
-      <w:pPr>
-        <w:spacing w:before="60" w:after="120"/>
-        <w:jc w:val="center"/>
-      </w:pPr>
-      <w:del w:id="1001" w:author="Figures" w:date="2026-08-10T00:00:00Z">
-        <w:r>
-          <w:rPr>
-            <w:i/>
-            <w:iCs/>
-          </w:rPr>
-          <w:delText xml:space="preserve">Figure 1.</w:delText>
-        </w:r>
-      </w:del>
-      <w:ins w:id="1002" w:author="Figures" w:date="2026-08-10T00:00:00Z">
-        <w:r>
-          <w:rPr>
-            <w:i/>
-            <w:iCs/>
-          </w:rPr>
-          <w:t xml:space="preserve">Figure 3.</w:t>
-        </w:r>
-      </w:ins>
-      <w:r>
-        <w:rPr>
-          <w:i/>
-          <w:iCs/>
-        </w:rPr>
-        <w:t xml:space="preserve"> A photo positioned under the grid — whatever falls inside the frame becomes the mosaic.</w:t>
-      </w:r>
-    </w:p>
-    <w:p>
-      <w:pPr>
-        <w:pStyle w:val="ListParagraph"/>
-        <w:numPr>
-          <w:ilvl w:val="0"/>
-          <w:numId w:val="20"/>
-        </w:numPr>
-        <w:spacing w:after="60"/>
-        <w:contextualSpacing w:val="0"/>
-        <w:rPr>
-          <w:rFonts w:eastAsia="Times New Roman"/>
-        </w:rPr>
-      </w:pPr>
-      <w:r>
-        <w:rPr>
-          <w:i/>
-          <w:iCs/>
-        </w:rPr>
-        <w:t>Move it</w:t>
-      </w:r>
-      <w:r>
-        <w:t xml:space="preserve"> — drag the frame's border. </w:t>
-      </w:r>
-      <w:r>
-        <w:rPr>
-          <w:i/>
-          <w:iCs/>
-        </w:rPr>
-        <w:t>Resize it</w:t>
-      </w:r>
-      <w:r>
-        <w:t xml:space="preserve"> — drag a corner (the cells stay square).</w:t>
-      </w:r>
-    </w:p>
-    <w:p>
-      <w:pPr>
-        <w:pStyle w:val="ListParagraph"/>
-        <w:numPr>
-          <w:ilvl w:val="0"/>
-          <w:numId w:val="20"/>
-        </w:numPr>
-        <w:spacing w:after="60"/>
-        <w:contextualSpacing w:val="0"/>
-        <w:rPr>
-          <w:rFonts w:eastAsia="Times New Roman"/>
-        </w:rPr>
-      </w:pPr>
-      <w:r>
-        <w:rPr>
-          <w:i/>
-          <w:iCs/>
-        </w:rPr>
-        <w:t>Fit to Photo</w:t>
-      </w:r>
-      <w:r>
-        <w:t xml:space="preserve"> — one press lays the grid over the photo for you: the largest area of the grid’s shape that fits the picture. Adjust from there if you want a different framing.</w:t>
-      </w:r>
-    </w:p>
-    <w:p>
-      <w:pPr>
-        <w:pStyle w:val="ListParagraph"/>
-        <w:numPr>
-          <w:ilvl w:val="0"/>
-          <w:numId w:val="20"/>
-        </w:numPr>
-        <w:spacing w:after="60"/>
-        <w:contextualSpacing w:val="0"/>
-        <w:rPr>
-          <w:rFonts w:eastAsia="Times New Roman"/>
-        </w:rPr>
-      </w:pPr>
-      <w:r>
-        <w:rPr>
-          <w:i/>
-          <w:iCs/>
-        </w:rPr>
-        <w:t>Across and Down</w:t>
-      </w:r>
-      <w:r>
-        <w:t xml:space="preserve"> — in the </w:t>
-      </w:r>
-      <w:r>
-        <w:rPr>
-          <w:i/>
-          <w:iCs/>
-        </w:rPr>
-        <w:t>Grid Controls</w:t>
-      </w:r>
-      <w:r>
-        <w:t xml:space="preserve"> section of Setup (press </w:t>
-      </w:r>
-      <w:r>
-        <w:rPr>
-          <w:i/>
-          <w:iCs/>
-        </w:rPr>
-        <w:t>Settings</w:t>
-      </w:r>
-      <w:r>
-        <w:t xml:space="preserve">), set how many tiles wide and tall. The standard baseplate is 32 × 32, and that is the default. The readout shows the real size — 32 × 32 tiles is about 256 mm square. A new size takes effect when you press Enter or leave the field, not while you are still typing it. If a mosaic is already there, the tiles that still fit are carried across and any that fall outside are counted for you; </w:t>
-      </w:r>
-      <w:r>
-        <w:rPr>
-          <w:i/>
-          <w:iCs/>
-        </w:rPr>
-        <w:t>Ctrl-Z</w:t>
-      </w:r>
-      <w:r>
-        <w:t xml:space="preserve"> puts the old grid back.</w:t>
-      </w:r>
-    </w:p>
-    <w:p>
-      <w:pPr>
-        <w:pStyle w:val="ListParagraph"/>
-        <w:numPr>
-          <w:ilvl w:val="0"/>
-          <w:numId w:val="20"/>
-        </w:numPr>
-        <w:spacing w:after="60"/>
-        <w:contextualSpacing w:val="0"/>
-        <w:rPr>
-          <w:rFonts w:eastAsia="Times New Roman"/>
-        </w:rPr>
-      </w:pPr>
-      <w:r>
-        <w:rPr>
-          <w:i/>
-          <w:iCs/>
-        </w:rPr>
-        <w:t>Show</w:t>
-      </w:r>
-      <w:r>
-        <w:t xml:space="preserve"> — three checkboxes for what you see on the workspace: </w:t>
-      </w:r>
-      <w:r>
-        <w:rPr>
-          <w:rStyle w:val="Strong"/>
-          <w:rFonts w:eastAsia="Times New Roman"/>
-        </w:rPr>
-        <w:t>Grid</w:t>
-      </w:r>
-      <w:r>
-        <w:t xml:space="preserve"> (the cell lines and the row and column labels — numbers across the top, letters down the side — that you follow while building), </w:t>
-      </w:r>
-      <w:r>
-        <w:rPr>
-          <w:rStyle w:val="Strong"/>
-          <w:rFonts w:eastAsia="Times New Roman"/>
-        </w:rPr>
-        <w:t>Baseplate</w:t>
-      </w:r>
-      <w:r>
-        <w:t xml:space="preserve"> (the studded plate behind the tiles), and </w:t>
-      </w:r>
-      <w:r>
-        <w:rPr>
-          <w:rStyle w:val="Strong"/>
-          <w:rFonts w:eastAsia="Times New Roman"/>
-        </w:rPr>
-        <w:t>Box</w:t>
-      </w:r>
-      <w:r>
-        <w:t xml:space="preserve"> (the outline around the mosaic). Turn any of them off — turn all three off to see just the mosaic itself.</w:t>
-      </w:r>
-    </w:p>
-    <w:p>
-      <w:pPr>
-        <w:pStyle w:val="NormalWeb"/>
-        <w:spacing w:beforeAutospacing="0" w:afterAutospacing="0"/>
-      </w:pPr>
-      <w:r>
-        <w:t>Fewer tiles across make bigger, blockier tiles and a coarser picture; more make a finer picture that needs more, smaller tiles.</w:t>
-      </w:r>
-    </w:p>
-    <w:p>
-      <w:pPr>
-        <w:pStyle w:val="Heading2"/>
-        <w:rPr>
-          <w:rFonts w:eastAsia="Times New Roman"/>
-        </w:rPr>
-      </w:pPr>
-      <w:bookmarkStart w:id="5" w:name="_Toc236986553"/>
-      <w:r>
-        <w:rPr>
-          <w:rFonts w:eastAsia="Times New Roman"/>
-        </w:rPr>
-        <w:lastRenderedPageBreak/>
-        <w:t>6. Build It!</w:t>
-      </w:r>
-      <w:bookmarkEnd w:id="5"/>
-    </w:p>
-    <w:p>
-      <w:pPr>
-        <w:pStyle w:val="NormalWeb"/>
-        <w:spacing w:beforeAutospacing="0" w:afterAutospacing="0"/>
-      </w:pPr>
-      <w:r>
-        <w:t xml:space="preserve">Press the green </w:t>
-      </w:r>
-      <w:r>
-        <w:rPr>
-          <w:rStyle w:val="Strong"/>
-          <w:rFonts w:eastAsia="Times New Roman"/>
-        </w:rPr>
-        <w:t>Build It!</w:t>
-      </w:r>
-      <w:r>
-        <w:t xml:space="preserve"> button and Sangala maps the framed picture to your palette colors, cell by cell, and shows the result on its baseplate. </w:t>
-      </w:r>
-      <w:r>
-        <w:rPr>
-          <w:rStyle w:val="Strong"/>
-          <w:rFonts w:eastAsia="Times New Roman"/>
-        </w:rPr>
-        <w:t>Transparent</w:t>
-      </w:r>
-      <w:r>
-        <w:t xml:space="preserve"> lets you check it against the photo. Building again over a same-size mosaic is one undo step — Ctrl-Z brings the previous mosaic back.</w:t>
-      </w:r>
-    </w:p>
-    <w:p>
-      <w:pPr>
-        <w:keepNext/>
-        <w:spacing w:before="120"/>
-        <w:jc w:val="center"/>
-      </w:pPr>
-      <w:r>
-        <w:rPr>
-          <w:noProof/>
-        </w:rPr>
-        <w:drawing>
-          <wp:inline distT="0" distB="0" distL="0" distR="0" wp14:anchorId="26B257E6" wp14:editId="22E2DC49">
-            <wp:extent cx="3017520" cy="2984464"/>
-            <wp:effectExtent l="0" t="0" r="0" b="0"/>
-            <wp:docPr id="1002" name="Figure2"/>
-            <wp:cNvGraphicFramePr>
-              <a:graphicFrameLocks xmlns:a="http://schemas.openxmlformats.org/drawingml/2006/main" noChangeAspect="1"/>
-            </wp:cNvGraphicFramePr>
-            <a:graphic xmlns:a="http://schemas.openxmlformats.org/drawingml/2006/main">
-              <a:graphicData uri="http://schemas.openxmlformats.org/drawingml/2006/picture">
-                <pic:pic xmlns:pic="http://schemas.openxmlformats.org/drawingml/2006/picture">
-                  <pic:nvPicPr>
-                    <pic:cNvPr id="1002" name="Figure2.png"/>
+                    <pic:cNvPr id="2000" name="Figure2000.png"/>
                     <pic:cNvPicPr/>
                   </pic:nvPicPr>
                   <pic:blipFill>
@@ -2555,7 +1524,7 @@
                   <pic:spPr>
                     <a:xfrm>
                       <a:off x="0" y="0"/>
-                      <a:ext cx="3017520" cy="2984464"/>
+                      <a:ext cx="5486400" cy="2999232"/>
                     </a:xfrm>
                     <a:prstGeom prst="rect">
                       <a:avLst/>
@@ -2573,31 +1542,29 @@
         <w:spacing w:before="60" w:after="120"/>
         <w:jc w:val="center"/>
       </w:pPr>
-      <w:del w:id="1003" w:author="Figures" w:date="2026-08-10T00:00:00Z">
-        <w:r>
-          <w:rPr>
-            <w:i/>
-            <w:iCs/>
-          </w:rPr>
-          <w:delText xml:space="preserve">Figure 2.</w:delText>
-        </w:r>
-      </w:del>
-      <w:ins w:id="1004" w:author="Figures" w:date="2026-08-10T00:00:00Z">
-        <w:r>
-          <w:rPr>
-            <w:i/>
-            <w:iCs/>
-          </w:rPr>
-          <w:t xml:space="preserve">Figure 4.</w:t>
-        </w:r>
-      </w:ins>
       <w:r>
         <w:rPr>
           <w:i/>
           <w:iCs/>
         </w:rPr>
-        <w:t xml:space="preserve"> The finished mosaic on its baseplate.</w:t>
-      </w:r>
+        <w:t>Figure 1. The four regions of the screen: the menu bar, the tools, the workspace, and the build panel.</w:t>
+      </w:r>
+    </w:p>
+    <w:p>
+      <w:pPr>
+        <w:pStyle w:val="Heading2"/>
+        <w:rPr>
+          <w:rFonts w:eastAsia="Times New Roman"/>
+        </w:rPr>
+      </w:pPr>
+      <w:bookmarkStart w:id="1" w:name="_Toc236986549"/>
+      <w:r>
+        <w:rPr>
+          <w:rFonts w:eastAsia="Times New Roman"/>
+        </w:rPr>
+        <w:t>2. The palette</w:t>
+      </w:r>
+      <w:bookmarkEnd w:id="1"/>
     </w:p>
     <w:p>
       <w:pPr>
@@ -2605,7 +1572,7 @@
         <w:spacing w:before="0" w:beforeAutospacing="0" w:after="60" w:afterAutospacing="0"/>
       </w:pPr>
       <w:r>
-        <w:t>Two controls in Adjust Mosaic set how the photo is mapped, and apply at the next Build It!:</w:t>
+        <w:t>The mosaic is built from the colors in the palette; the tile list counts how many of each the design uses.</w:t>
       </w:r>
     </w:p>
     <w:p>
@@ -2626,10 +1593,80 @@
           <w:rStyle w:val="Strong"/>
           <w:rFonts w:eastAsia="Times New Roman"/>
         </w:rPr>
-        <w:t>Ignore the background</w:t>
-      </w:r>
-      <w:r>
-        <w:t xml:space="preserve"> (on by default) — treats the removed or empty background as empty cells, so thin parts like legs survive instead of being outvoted by a sea of sky.</w:t>
+        <w:t>The palette drives the mosaic.</w:t>
+      </w:r>
+      <w:r>
+        <w:t xml:space="preserve"> Down the right side is the </w:t>
+      </w:r>
+      <w:r>
+        <w:rPr>
+          <w:i/>
+          <w:iCs/>
+        </w:rPr>
+        <w:t>Palette</w:t>
+      </w:r>
+      <w:r>
+        <w:t xml:space="preserve"> — real LEGO tile colors, including several grays from very light to dark, so a mostly-gray subject still shows its shading. The mosaic uses only these colors. To change them, press </w:t>
+      </w:r>
+      <w:r>
+        <w:rPr>
+          <w:i/>
+          <w:iCs/>
+        </w:rPr>
+        <w:t>Tile Colors</w:t>
+      </w:r>
+      <w:r>
+        <w:t xml:space="preserve"> and then </w:t>
+      </w:r>
+      <w:r>
+        <w:rPr>
+          <w:i/>
+          <w:iCs/>
+        </w:rPr>
+        <w:t>Edit</w:t>
+      </w:r>
+      <w:r>
+        <w:t xml:space="preserve">: click a color to turn it </w:t>
+      </w:r>
+      <w:r>
+        <w:rPr>
+          <w:rStyle w:val="Strong"/>
+          <w:rFonts w:eastAsia="Times New Roman"/>
+        </w:rPr>
+        <w:t>off</w:t>
+      </w:r>
+      <w:r>
+        <w:t xml:space="preserve"> or back </w:t>
+      </w:r>
+      <w:r>
+        <w:rPr>
+          <w:rStyle w:val="Strong"/>
+          <w:rFonts w:eastAsia="Times New Roman"/>
+        </w:rPr>
+        <w:t>on</w:t>
+      </w:r>
+      <w:r>
+        <w:t xml:space="preserve">. </w:t>
+      </w:r>
+      <w:r>
+        <w:rPr>
+          <w:i/>
+          <w:iCs/>
+        </w:rPr>
+        <w:t>Clear</w:t>
+      </w:r>
+      <w:r>
+        <w:t xml:space="preserve"> empties the palette so you can add just the colors you want; </w:t>
+      </w:r>
+      <w:r>
+        <w:rPr>
+          <w:i/>
+          <w:iCs/>
+        </w:rPr>
+        <w:t>Reset</w:t>
+      </w:r>
+      <w:r>
+        <w:t xml:space="preserve"> brings back the standard set.</w:t>
       </w:r>
     </w:p>
     <w:p>
@@ -2650,19 +1687,47 @@
           <w:rStyle w:val="Strong"/>
           <w:rFonts w:eastAsia="Times New Roman"/>
         </w:rPr>
-        <w:t>Clean up stray tiles</w:t>
-      </w:r>
-      <w:r>
-        <w:t xml:space="preserve"> — gently fills single-tile holes and drops lone stray tiles, so the mosaic reads cleanly without erasing real detail.</w:t>
-      </w:r>
-    </w:p>
-    <w:p>
-      <w:pPr>
-        <w:pStyle w:val="NormalWeb"/>
-        <w:spacing w:before="0" w:beforeAutospacing="0" w:after="60" w:afterAutospacing="0"/>
-      </w:pPr>
-      <w:r>
-        <w:t>The other three adjust the mosaic as it stands: every filled cell is re-mapped from its own source color — hand-placed tiles included. Filled cells stay filled, empty cells stay empty, and each slider gesture is one undo step:</w:t>
+        <w:lastRenderedPageBreak/>
+        <w:t>The None swatch.</w:t>
+      </w:r>
+      <w:r>
+        <w:t xml:space="preserve"> First in the palette, a red ✕ — not a color but “no tile.” With tiles or a part selected, </w:t>
+      </w:r>
+      <w:proofErr w:type="gramStart"/>
+      <w:r>
+        <w:t>clicking it</w:t>
+      </w:r>
+      <w:proofErr w:type="gramEnd"/>
+      <w:r>
+        <w:t xml:space="preserve"> empties them (one undo step); in a painting tool it switches to </w:t>
+      </w:r>
+      <w:r>
+        <w:rPr>
+          <w:i/>
+          <w:iCs/>
+        </w:rPr>
+        <w:t>Erase</w:t>
+      </w:r>
+      <w:r>
+        <w:t xml:space="preserve">. It is hidden inside </w:t>
+      </w:r>
+      <w:r>
+        <w:rPr>
+          <w:i/>
+          <w:iCs/>
+        </w:rPr>
+        <w:t>Edit</w:t>
+      </w:r>
+      <w:r>
+        <w:t xml:space="preserve">, where none </w:t>
+      </w:r>
+      <w:proofErr w:type="gramStart"/>
+      <w:r>
+        <w:t>is not</w:t>
+      </w:r>
+      <w:proofErr w:type="gramEnd"/>
+      <w:r>
+        <w:t xml:space="preserve"> a color.</w:t>
       </w:r>
     </w:p>
     <w:p>
@@ -2683,10 +1748,50 @@
           <w:rStyle w:val="Strong"/>
           <w:rFonts w:eastAsia="Times New Roman"/>
         </w:rPr>
-        <w:t>Colors</w:t>
-      </w:r>
-      <w:r>
-        <w:t xml:space="preserve"> — how many different tile colors to reduce the picture to. A low number gives a bolder, simpler mosaic; a high number gives more shading. Sangala always snaps these to the nearest palette colors.</w:t>
+        <w:t>Add colors from a photo.</w:t>
+      </w:r>
+      <w:r>
+        <w:t xml:space="preserve"> </w:t>
+      </w:r>
+      <w:r>
+        <w:rPr>
+          <w:i/>
+          <w:iCs/>
+        </w:rPr>
+        <w:t>Add Tile Colors in a Photo</w:t>
+      </w:r>
+      <w:r>
+        <w:t xml:space="preserve"> (under </w:t>
+      </w:r>
+      <w:r>
+        <w:rPr>
+          <w:i/>
+          <w:iCs/>
+        </w:rPr>
+        <w:t>Tile Colors</w:t>
+      </w:r>
+      <w:r>
+        <w:t xml:space="preserve">) reads the LEGO colors out of a photo in the workspace — loose tiles, a tray of them, or a mosaic already built — and adds them to the palette as </w:t>
+      </w:r>
+      <w:r>
+        <w:rPr>
+          <w:i/>
+          <w:iCs/>
+        </w:rPr>
+        <w:t>Custom Tiles</w:t>
+      </w:r>
+      <w:r>
+        <w:t xml:space="preserve">, kept beside the </w:t>
+      </w:r>
+      <w:r>
+        <w:rPr>
+          <w:i/>
+          <w:iCs/>
+        </w:rPr>
+        <w:t>Standard Tiles</w:t>
+      </w:r>
+      <w:r>
+        <w:t>.</w:t>
       </w:r>
     </w:p>
     <w:p>
@@ -2707,78 +1812,38 @@
           <w:rStyle w:val="Strong"/>
           <w:rFonts w:eastAsia="Times New Roman"/>
         </w:rPr>
-        <w:t>Contrast</w:t>
-      </w:r>
-      <w:r>
-        <w:t xml:space="preserve"> and </w:t>
-      </w:r>
-      <w:r>
-        <w:rPr>
-          <w:rStyle w:val="Strong"/>
-          <w:rFonts w:eastAsia="Times New Roman"/>
-        </w:rPr>
-        <w:t>Brightness</w:t>
-      </w:r>
-      <w:r>
-        <w:t xml:space="preserve"> — shift every filled cell’s color, darker, lighter, or further apart, before it snaps to the nearest palette color.</w:t>
-      </w:r>
-    </w:p>
-    <w:p>
-      <w:pPr>
-        <w:pStyle w:val="ListParagraph"/>
-        <w:numPr>
-          <w:ilvl w:val="0"/>
-          <w:numId w:val="19"/>
-        </w:numPr>
-        <w:spacing w:after="60"/>
-        <w:contextualSpacing w:val="0"/>
-        <w:rPr>
-          <w:rFonts w:eastAsia="Times New Roman"/>
-        </w:rPr>
-      </w:pPr>
-      <w:r>
-        <w:rPr>
-          <w:rStyle w:val="Strong"/>
-          <w:rFonts w:eastAsia="Times New Roman"/>
-        </w:rPr>
-        <w:t>Clear Mosaic</w:t>
-      </w:r>
-      <w:r>
-        <w:t xml:space="preserve"> — empties every cell as one undo step. Photos, palette, grid, and parts stay.</w:t>
-      </w:r>
-    </w:p>
-    <w:p>
-      <w:pPr>
-        <w:pStyle w:val="NormalWeb"/>
-        <w:spacing w:beforeAutospacing="0" w:afterAutospacing="0"/>
-      </w:pPr>
-      <w:r>
-        <w:t>Cells can also be edited one at a time with the hand tools (Section 10).</w:t>
-      </w:r>
-    </w:p>
-    <w:p>
-      <w:pPr>
-        <w:pStyle w:val="Heading2"/>
-        <w:rPr>
-          <w:rFonts w:eastAsia="Times New Roman"/>
-        </w:rPr>
-      </w:pPr>
-      <w:bookmarkStart w:id="6" w:name="_Toc236986554"/>
-      <w:r>
-        <w:rPr>
-          <w:rFonts w:eastAsia="Times New Roman"/>
-        </w:rPr>
-        <w:t>7. Line art: rendering a drawing</w:t>
-      </w:r>
-      <w:bookmarkEnd w:id="6"/>
-    </w:p>
-    <w:p>
-      <w:pPr>
-        <w:pStyle w:val="NormalWeb"/>
-        <w:spacing w:before="0" w:beforeAutospacing="0" w:after="60" w:afterAutospacing="0"/>
-      </w:pPr>
-      <w:r>
-        <w:t>Sample as line art (in Adjust Mosaic) suits a drawing rather than a photograph. Every cell is judged to be line, color, or paper: a cell mostly covered by ink takes Black, a cell carrying color takes that color, and a cell with neither is left empty, so the paper of the drawing becomes bare baseplate. With the setting off, a cell instead takes the average of the pixels beneath it, and a cell straddling an ink line averages ink and paper together into a gray that appears nowhere in the drawing.</w:t>
+        <w:t>The tile list counts every color.</w:t>
+      </w:r>
+      <w:r>
+        <w:t xml:space="preserve"> After you build, the status line totals </w:t>
+      </w:r>
+      <w:proofErr w:type="gramStart"/>
+      <w:r>
+        <w:t>them, and</w:t>
+      </w:r>
+      <w:proofErr w:type="gramEnd"/>
+      <w:r>
+        <w:t xml:space="preserve"> </w:t>
+      </w:r>
+      <w:r>
+        <w:rPr>
+          <w:i/>
+          <w:iCs/>
+        </w:rPr>
+        <w:t>Save</w:t>
+      </w:r>
+      <w:r>
+        <w:t xml:space="preserve"> → </w:t>
+      </w:r>
+      <w:r>
+        <w:rPr>
+          <w:i/>
+          <w:iCs/>
+        </w:rPr>
+        <w:t>Tile List</w:t>
+      </w:r>
+      <w:r>
+        <w:t xml:space="preserve"> writes every color with its count — “47 dark gray, 23 white, 8 red…” — the list to order from or build against. The printed sheet carries the same counts beneath the picture.</w:t>
       </w:r>
     </w:p>
     <w:p>
@@ -2791,12 +1856,11 @@
         <w:rPr>
           <w:noProof/>
         </w:rPr>
-        <w:lastRenderedPageBreak/>
         <w:drawing>
-          <wp:inline distT="0" distB="0" distL="0" distR="0" wp14:anchorId="41455620" wp14:editId="1C05D468">
-            <wp:extent cx="5394960" cy="1888991"/>
+          <wp:inline distT="0" distB="0" distL="0" distR="0" wp14:anchorId="06AE90DA" wp14:editId="71F7ADEB">
+            <wp:extent cx="2468880" cy="2409626"/>
             <wp:effectExtent l="0" t="0" r="0" b="0"/>
-            <wp:docPr id="178688822" name="Figure1"/>
+            <wp:docPr id="2001" name="Figure2001"/>
             <wp:cNvGraphicFramePr>
               <a:graphicFrameLocks xmlns:a="http://schemas.openxmlformats.org/drawingml/2006/main" noChangeAspect="1"/>
             </wp:cNvGraphicFramePr>
@@ -2804,7 +1868,7 @@
               <a:graphicData uri="http://schemas.openxmlformats.org/drawingml/2006/picture">
                 <pic:pic xmlns:pic="http://schemas.openxmlformats.org/drawingml/2006/picture">
                   <pic:nvPicPr>
-                    <pic:cNvPr id="1001" name="Figure1.png"/>
+                    <pic:cNvPr id="2001" name="Figure2001.png"/>
                     <pic:cNvPicPr/>
                   </pic:nvPicPr>
                   <pic:blipFill>
@@ -2816,7 +1880,7 @@
                   <pic:spPr>
                     <a:xfrm>
                       <a:off x="0" y="0"/>
-                      <a:ext cx="5394960" cy="1888991"/>
+                      <a:ext cx="2468880" cy="2409626"/>
                     </a:xfrm>
                     <a:prstGeom prst="rect">
                       <a:avLst/>
@@ -2834,31 +1898,214 @@
         <w:spacing w:before="60" w:after="120"/>
         <w:jc w:val="center"/>
       </w:pPr>
-      <w:del w:id="1005" w:author="Figures" w:date="2026-08-10T00:00:00Z">
-        <w:r>
-          <w:rPr>
-            <w:i/>
-            <w:iCs/>
-          </w:rPr>
-          <w:delText xml:space="preserve">Figure 3.</w:delText>
-        </w:r>
-      </w:del>
-      <w:ins w:id="1006" w:author="Figures" w:date="2026-08-10T00:00:00Z">
-        <w:r>
-          <w:rPr>
-            <w:i/>
-            <w:iCs/>
-          </w:rPr>
-          <w:t xml:space="preserve">Figure 5.</w:t>
-        </w:r>
-      </w:ins>
       <w:r>
         <w:rPr>
           <w:i/>
           <w:iCs/>
         </w:rPr>
-        <w:t xml:space="preserve"> The same drawing averaged, and with Sample as line art on.</w:t>
-      </w:r>
+        <w:t>Figure 2. The palette, with Tile Colors</w:t>
+      </w:r>
+      <w:proofErr w:type="gramStart"/>
+      <w:r>
+        <w:rPr>
+          <w:i/>
+          <w:iCs/>
+        </w:rPr>
+        <w:t xml:space="preserve"> open</w:t>
+      </w:r>
+      <w:proofErr w:type="gramEnd"/>
+      <w:r>
+        <w:rPr>
+          <w:i/>
+          <w:iCs/>
+        </w:rPr>
+        <w:t xml:space="preserve"> for editing.</w:t>
+      </w:r>
+    </w:p>
+    <w:p>
+      <w:pPr>
+        <w:pStyle w:val="Heading2"/>
+        <w:rPr>
+          <w:rFonts w:eastAsia="Times New Roman"/>
+        </w:rPr>
+      </w:pPr>
+      <w:bookmarkStart w:id="2" w:name="_Toc236986550"/>
+      <w:r>
+        <w:rPr>
+          <w:rFonts w:eastAsia="Times New Roman"/>
+        </w:rPr>
+        <w:t>3. Open a photo (and build a scene)</w:t>
+      </w:r>
+      <w:bookmarkEnd w:id="2"/>
+    </w:p>
+    <w:p>
+      <w:pPr>
+        <w:pStyle w:val="ListParagraph"/>
+        <w:numPr>
+          <w:ilvl w:val="0"/>
+          <w:numId w:val="20"/>
+        </w:numPr>
+        <w:spacing w:after="60"/>
+        <w:contextualSpacing w:val="0"/>
+        <w:rPr>
+          <w:rFonts w:eastAsia="Times New Roman"/>
+        </w:rPr>
+      </w:pPr>
+      <w:r>
+        <w:t xml:space="preserve">Click </w:t>
+      </w:r>
+      <w:r>
+        <w:rPr>
+          <w:rStyle w:val="Strong"/>
+          <w:rFonts w:eastAsia="Times New Roman"/>
+        </w:rPr>
+        <w:t>Open</w:t>
+      </w:r>
+      <w:r>
+        <w:t xml:space="preserve"> (or drag a picture onto the workspace). Sangala accepts </w:t>
+      </w:r>
+      <w:r>
+        <w:rPr>
+          <w:rStyle w:val="Strong"/>
+          <w:rFonts w:eastAsia="Times New Roman"/>
+        </w:rPr>
+        <w:t>.</w:t>
+      </w:r>
+      <w:proofErr w:type="spellStart"/>
+      <w:r>
+        <w:rPr>
+          <w:rStyle w:val="Strong"/>
+          <w:rFonts w:eastAsia="Times New Roman"/>
+        </w:rPr>
+        <w:t>png</w:t>
+      </w:r>
+      <w:proofErr w:type="spellEnd"/>
+      <w:r>
+        <w:t xml:space="preserve"> and </w:t>
+      </w:r>
+      <w:r>
+        <w:rPr>
+          <w:rStyle w:val="Strong"/>
+          <w:rFonts w:eastAsia="Times New Roman"/>
+        </w:rPr>
+        <w:t>.jpg</w:t>
+      </w:r>
+      <w:r>
+        <w:t>.</w:t>
+      </w:r>
+    </w:p>
+    <w:p>
+      <w:pPr>
+        <w:pStyle w:val="ListParagraph"/>
+        <w:numPr>
+          <w:ilvl w:val="0"/>
+          <w:numId w:val="20"/>
+        </w:numPr>
+        <w:spacing w:after="60"/>
+        <w:contextualSpacing w:val="0"/>
+        <w:rPr>
+          <w:rFonts w:eastAsia="Times New Roman"/>
+        </w:rPr>
+      </w:pPr>
+      <w:r>
+        <w:t xml:space="preserve">The photo drops onto the workspace at a comfortable size. </w:t>
+      </w:r>
+      <w:r>
+        <w:rPr>
+          <w:i/>
+          <w:iCs/>
+        </w:rPr>
+        <w:t>Drag its body</w:t>
+      </w:r>
+      <w:r>
+        <w:t xml:space="preserve"> to move it; </w:t>
+      </w:r>
+      <w:r>
+        <w:rPr>
+          <w:i/>
+          <w:iCs/>
+        </w:rPr>
+        <w:t>drag a corner handle</w:t>
+      </w:r>
+      <w:r>
+        <w:t xml:space="preserve"> to resize it (the shape is kept, so it never stretches). Press </w:t>
+      </w:r>
+      <w:r>
+        <w:rPr>
+          <w:i/>
+          <w:iCs/>
+        </w:rPr>
+        <w:t>Delete</w:t>
+      </w:r>
+      <w:r>
+        <w:t xml:space="preserve"> to remove a selected photo.</w:t>
+      </w:r>
+    </w:p>
+    <w:p>
+      <w:pPr>
+        <w:pStyle w:val="ListParagraph"/>
+        <w:numPr>
+          <w:ilvl w:val="0"/>
+          <w:numId w:val="20"/>
+        </w:numPr>
+        <w:spacing w:after="60"/>
+        <w:contextualSpacing w:val="0"/>
+        <w:rPr>
+          <w:rFonts w:eastAsia="Times New Roman"/>
+        </w:rPr>
+      </w:pPr>
+      <w:r>
+        <w:rPr>
+          <w:i/>
+          <w:iCs/>
+        </w:rPr>
+        <w:t>Open again to add another picture.</w:t>
+      </w:r>
+      <w:r>
+        <w:t xml:space="preserve"> Each </w:t>
+      </w:r>
+      <w:r>
+        <w:rPr>
+          <w:rStyle w:val="Strong"/>
+          <w:rFonts w:eastAsia="Times New Roman"/>
+        </w:rPr>
+        <w:t>Open</w:t>
+      </w:r>
+      <w:r>
+        <w:t xml:space="preserve"> adds a layer, so you can build a scene — a background behind, a subject in front — and turn the whole composite into one mosaic.</w:t>
+      </w:r>
+    </w:p>
+    <w:p>
+      <w:pPr>
+        <w:pStyle w:val="NormalWeb"/>
+        <w:spacing w:beforeAutospacing="0" w:afterAutospacing="0"/>
+      </w:pPr>
+      <w:r>
+        <w:rPr>
+          <w:i/>
+          <w:iCs/>
+        </w:rPr>
+        <w:t>Layer order (which picture is in front).</w:t>
+      </w:r>
+      <w:r>
+        <w:t xml:space="preserve"> Select a picture to open its panel on the right, then use the layer controls there to send it forward or back, so the foreground animal sits on top of the background.</w:t>
+      </w:r>
+    </w:p>
+    <w:p>
+      <w:pPr>
+        <w:pStyle w:val="Heading2"/>
+        <w:rPr>
+          <w:rFonts w:eastAsia="Times New Roman"/>
+        </w:rPr>
+      </w:pPr>
+      <w:bookmarkStart w:id="3" w:name="_Toc236986551"/>
+      <w:r>
+        <w:rPr>
+          <w:rFonts w:eastAsia="Times New Roman"/>
+        </w:rPr>
+        <w:t>4. Remove the background</w:t>
+      </w:r>
+      <w:bookmarkEnd w:id="3"/>
     </w:p>
     <w:p>
       <w:pPr>
@@ -2866,7 +2113,143 @@
         <w:spacing w:before="0" w:beforeAutospacing="0" w:after="60" w:afterAutospacing="0"/>
       </w:pPr>
       <w:r>
-        <w:t>The line is drawn in Black. If Black is switched off in the palette, the status line names the color used in its place. Line art works with any medium; in Dots the drawing reads as marks on paper, which is closest to how it was made.</w:t>
+        <w:t>Remove Background clears the backdrop from a picture so that only the subject becomes tiles:</w:t>
+      </w:r>
+    </w:p>
+    <w:p>
+      <w:pPr>
+        <w:pStyle w:val="ListParagraph"/>
+        <w:numPr>
+          <w:ilvl w:val="0"/>
+          <w:numId w:val="20"/>
+        </w:numPr>
+        <w:spacing w:after="60"/>
+        <w:contextualSpacing w:val="0"/>
+        <w:rPr>
+          <w:rFonts w:eastAsia="Times New Roman"/>
+        </w:rPr>
+      </w:pPr>
+      <w:r>
+        <w:t>Select the picture.</w:t>
+      </w:r>
+    </w:p>
+    <w:p>
+      <w:pPr>
+        <w:pStyle w:val="ListParagraph"/>
+        <w:numPr>
+          <w:ilvl w:val="0"/>
+          <w:numId w:val="20"/>
+        </w:numPr>
+        <w:spacing w:after="60"/>
+        <w:contextualSpacing w:val="0"/>
+        <w:rPr>
+          <w:rFonts w:eastAsia="Times New Roman"/>
+        </w:rPr>
+      </w:pPr>
+      <w:r>
+        <w:t xml:space="preserve">In its panel, turn on </w:t>
+      </w:r>
+      <w:r>
+        <w:rPr>
+          <w:rStyle w:val="Strong"/>
+          <w:rFonts w:eastAsia="Times New Roman"/>
+        </w:rPr>
+        <w:t>Remove Background</w:t>
+      </w:r>
+      <w:r>
+        <w:t>. Sangala clears the backdrop from the edges inward and leaves the subject — keeping interior whites (a crane's white belly stays; only the true background goes).</w:t>
+      </w:r>
+    </w:p>
+    <w:p>
+      <w:pPr>
+        <w:pStyle w:val="ListParagraph"/>
+        <w:numPr>
+          <w:ilvl w:val="0"/>
+          <w:numId w:val="20"/>
+        </w:numPr>
+        <w:spacing w:after="60"/>
+        <w:contextualSpacing w:val="0"/>
+        <w:rPr>
+          <w:rFonts w:eastAsia="Times New Roman"/>
+        </w:rPr>
+      </w:pPr>
+      <w:r>
+        <w:t xml:space="preserve">The original is never lost. Turn </w:t>
+      </w:r>
+      <w:r>
+        <w:rPr>
+          <w:rStyle w:val="Strong"/>
+          <w:rFonts w:eastAsia="Times New Roman"/>
+        </w:rPr>
+        <w:t>Remove Background</w:t>
+      </w:r>
+      <w:r>
+        <w:t xml:space="preserve"> off to bring the backdrop back.</w:t>
+      </w:r>
+    </w:p>
+    <w:p>
+      <w:pPr>
+        <w:pStyle w:val="NormalWeb"/>
+        <w:spacing w:beforeAutospacing="0" w:afterAutospacing="0"/>
+      </w:pPr>
+      <w:r>
+        <w:t xml:space="preserve">With the background removed, the empty area around the subject becomes </w:t>
+      </w:r>
+      <w:r>
+        <w:rPr>
+          <w:rStyle w:val="Strong"/>
+          <w:rFonts w:eastAsia="Times New Roman"/>
+        </w:rPr>
+        <w:t>empty cells</w:t>
+      </w:r>
+      <w:r>
+        <w:t xml:space="preserve"> in the mosaic (or bare baseplate), not tiles.</w:t>
+      </w:r>
+    </w:p>
+    <w:p>
+      <w:pPr>
+        <w:pStyle w:val="Heading2"/>
+        <w:rPr>
+          <w:rFonts w:eastAsia="Times New Roman"/>
+        </w:rPr>
+      </w:pPr>
+      <w:bookmarkStart w:id="4" w:name="_Toc236986552"/>
+      <w:r>
+        <w:rPr>
+          <w:rFonts w:eastAsia="Times New Roman"/>
+        </w:rPr>
+        <w:lastRenderedPageBreak/>
+        <w:t>5. The grid — framing the mosaic</w:t>
+      </w:r>
+      <w:bookmarkEnd w:id="4"/>
+    </w:p>
+    <w:p>
+      <w:pPr>
+        <w:pStyle w:val="NormalWeb"/>
+        <w:spacing w:before="0" w:beforeAutospacing="0" w:after="60" w:afterAutospacing="0"/>
+      </w:pPr>
+      <w:r>
+        <w:t xml:space="preserve">The </w:t>
+      </w:r>
+      <w:r>
+        <w:rPr>
+          <w:rStyle w:val="Strong"/>
+          <w:rFonts w:eastAsia="Times New Roman"/>
+        </w:rPr>
+        <w:t>grid frame</w:t>
+      </w:r>
+      <w:r>
+        <w:t xml:space="preserve"> is the box on the workspace that decides what becomes the mosaic and how fine it is. Whatever falls </w:t>
+      </w:r>
+      <w:r>
+        <w:rPr>
+          <w:rStyle w:val="Strong"/>
+          <w:rFonts w:eastAsia="Times New Roman"/>
+        </w:rPr>
+        <w:t>inside</w:t>
+      </w:r>
+      <w:r>
+        <w:t xml:space="preserve"> the frame is what gets built.</w:t>
       </w:r>
     </w:p>
     <w:p>
@@ -2881,9 +2264,9 @@
         </w:rPr>
         <w:drawing>
           <wp:inline distT="0" distB="0" distL="0" distR="0" wp14:anchorId="41455620" wp14:editId="1C05D468">
-            <wp:extent cx="5669280" cy="1839760"/>
+            <wp:extent cx="3017520" cy="2984464"/>
             <wp:effectExtent l="0" t="0" r="0" b="0"/>
-            <wp:docPr id="1877548301" name="Figure1"/>
+            <wp:docPr id="1001" name="Figure1"/>
             <wp:cNvGraphicFramePr>
               <a:graphicFrameLocks xmlns:a="http://schemas.openxmlformats.org/drawingml/2006/main" noChangeAspect="1"/>
             </wp:cNvGraphicFramePr>
@@ -2903,7 +2286,7 @@
                   <pic:spPr>
                     <a:xfrm>
                       <a:off x="0" y="0"/>
-                      <a:ext cx="5669280" cy="1839760"/>
+                      <a:ext cx="3017520" cy="2984464"/>
                     </a:xfrm>
                     <a:prstGeom prst="rect">
                       <a:avLst/>
@@ -2921,65 +2304,19 @@
         <w:spacing w:before="60" w:after="120"/>
         <w:jc w:val="center"/>
       </w:pPr>
-      <w:del w:id="1007" w:author="Figures" w:date="2026-08-10T00:00:00Z">
-        <w:r>
-          <w:rPr>
-            <w:i/>
-            <w:iCs/>
-          </w:rPr>
-          <w:delText xml:space="preserve">Figure 4.</w:delText>
-        </w:r>
-      </w:del>
-      <w:ins w:id="1008" w:author="Figures" w:date="2026-08-10T00:00:00Z">
-        <w:r>
-          <w:rPr>
-            <w:i/>
-            <w:iCs/>
-          </w:rPr>
-          <w:t xml:space="preserve">Figure 6.</w:t>
-        </w:r>
-      </w:ins>
       <w:r>
         <w:rPr>
           <w:i/>
           <w:iCs/>
         </w:rPr>
-        <w:t xml:space="preserve"> A drawing rendered as dots, beside its source.</w:t>
-      </w:r>
-    </w:p>
-    <w:p>
-      <w:pPr>
-        <w:pStyle w:val="Heading2"/>
-        <w:rPr>
-          <w:rFonts w:eastAsia="Times New Roman"/>
-        </w:rPr>
-      </w:pPr>
-      <w:bookmarkStart w:id="7" w:name="_Toc236986555"/>
-      <w:r>
-        <w:rPr>
-          <w:rFonts w:eastAsia="Times New Roman"/>
-        </w:rPr>
-        <w:t>8. The medium: tiles, dots, and beads</w:t>
-      </w:r>
-      <w:bookmarkEnd w:id="7"/>
-    </w:p>
-    <w:p>
-      <w:pPr>
-        <w:pStyle w:val="NormalWeb"/>
-        <w:spacing w:before="0" w:beforeAutospacing="0" w:after="60" w:afterAutospacing="0"/>
-      </w:pPr>
-      <w:r>
-        <w:t xml:space="preserve">The built mosaic sits on a </w:t>
-      </w:r>
-      <w:r>
-        <w:rPr>
-          <w:rStyle w:val="Strong"/>
-          <w:rFonts w:eastAsia="Times New Roman"/>
-        </w:rPr>
-        <w:t>baseplate</w:t>
-      </w:r>
-      <w:r>
-        <w:t xml:space="preserve"> — the studded plate the tiles snap onto — so you see it the way it will really look.</w:t>
+        <w:t>Figure 3.</w:t>
+      </w:r>
+      <w:r>
+        <w:rPr>
+          <w:i/>
+          <w:iCs/>
+        </w:rPr>
+        <w:t xml:space="preserve"> A photo positioned under the grid — whatever falls inside the frame becomes the mosaic.</w:t>
       </w:r>
     </w:p>
     <w:p>
@@ -2987,7 +2324,7 @@
         <w:pStyle w:val="ListParagraph"/>
         <w:numPr>
           <w:ilvl w:val="0"/>
-          <w:numId w:val="19"/>
+          <w:numId w:val="20"/>
         </w:numPr>
         <w:spacing w:after="60"/>
         <w:contextualSpacing w:val="0"/>
@@ -2997,43 +2334,23 @@
       </w:pPr>
       <w:r>
         <w:rPr>
-          <w:rStyle w:val="Strong"/>
-          <w:rFonts w:eastAsia="Times New Roman"/>
-        </w:rPr>
-        <w:t>Baseplate color</w:t>
-      </w:r>
-      <w:r>
-        <w:t xml:space="preserve"> — choose from the </w:t>
-      </w:r>
-      <w:r>
-        <w:rPr>
           <w:i/>
           <w:iCs/>
         </w:rPr>
-        <w:t>Baseplate</w:t>
-      </w:r>
-      <w:r>
-        <w:t xml:space="preserve"> swatches in Setup (press </w:t>
+        <w:t>Move it</w:t>
+      </w:r>
+      <w:r>
+        <w:t xml:space="preserve"> — drag the frame's border. </w:t>
       </w:r>
       <w:r>
         <w:rPr>
           <w:i/>
           <w:iCs/>
         </w:rPr>
-        <w:t>Settings</w:t>
-      </w:r>
-      <w:r>
-        <w:t xml:space="preserve">). These are limited to the colors LEGO actually sells baseplates in (White, Green, Gray, Blue, Sand (Tan), Black, Red, and Light Blue). </w:t>
-      </w:r>
-      <w:r>
-        <w:rPr>
-          <w:rStyle w:val="Strong"/>
-          <w:rFonts w:eastAsia="Times New Roman"/>
-        </w:rPr>
-        <w:t>White</w:t>
-      </w:r>
-      <w:r>
-        <w:t xml:space="preserve"> is the default.</w:t>
+        <w:t>Resize it</w:t>
+      </w:r>
+      <w:r>
+        <w:t xml:space="preserve"> — drag a corner (the cells stay square).</w:t>
       </w:r>
     </w:p>
     <w:p>
@@ -3041,7 +2358,7 @@
         <w:pStyle w:val="ListParagraph"/>
         <w:numPr>
           <w:ilvl w:val="0"/>
-          <w:numId w:val="19"/>
+          <w:numId w:val="20"/>
         </w:numPr>
         <w:spacing w:after="60"/>
         <w:contextualSpacing w:val="0"/>
@@ -3051,36 +2368,207 @@
       </w:pPr>
       <w:r>
         <w:rPr>
-          <w:rStyle w:val="Strong"/>
-          <w:rFonts w:eastAsia="Times New Roman"/>
-        </w:rPr>
-        <w:t>Show or hide</w:t>
-      </w:r>
-      <w:r>
-        <w:t xml:space="preserve"> — the </w:t>
-      </w:r>
-      <w:r>
-        <w:rPr>
-          <w:rStyle w:val="Strong"/>
-          <w:rFonts w:eastAsia="Times New Roman"/>
-        </w:rPr>
-        <w:t>Baseplate</w:t>
-      </w:r>
-      <w:r>
-        <w:t xml:space="preserve"> checkbox hides the plate for a clean, chart-like view of just the tiles (handy for reading the pattern). With the plate shown, the studs mark the grid; hide it and the cell lines return so empty cells stay clear.</w:t>
-      </w:r>
-    </w:p>
-    <w:p>
-      <w:pPr>
-        <w:pStyle w:val="NormalWeb"/>
-        <w:spacing w:before="0" w:beforeAutospacing="0" w:after="60" w:afterAutospacing="0"/>
-      </w:pPr>
-      <w:r>
-        <w:rPr>
           <w:i/>
           <w:iCs/>
         </w:rPr>
-        <w:t>Medium (in Setup) chooses how the mosaic is drawn. Tiles is square LEGO tiles on the studded baseplate; Dots is dot stickers, or marker dots, on poster paper; Beads is round beads on a plain tray. For Dots and Beads the Baseplate color is that surface and shows between the elements; only Tiles has studs, so with Grid on the cell lines show. The palette is named for the medium — Tile Colors, Dot Colors, or Bead Colors — and Dots offers sixteen colors the others do not. The choice carries through the workspace, the saved image, and the printed sheet, and saves with the project.</w:t>
+        <w:t>Fit to Photo</w:t>
+      </w:r>
+      <w:r>
+        <w:t xml:space="preserve"> — one press lays the grid over the photo for you: the largest area of the grid’s shape that fits the picture. Adjust from there if you want a different </w:t>
+      </w:r>
+      <w:proofErr w:type="gramStart"/>
+      <w:r>
+        <w:t>framing</w:t>
+      </w:r>
+      <w:proofErr w:type="gramEnd"/>
+      <w:r>
+        <w:t>.</w:t>
+      </w:r>
+    </w:p>
+    <w:p>
+      <w:pPr>
+        <w:pStyle w:val="ListParagraph"/>
+        <w:numPr>
+          <w:ilvl w:val="0"/>
+          <w:numId w:val="20"/>
+        </w:numPr>
+        <w:spacing w:after="60"/>
+        <w:contextualSpacing w:val="0"/>
+        <w:rPr>
+          <w:rFonts w:eastAsia="Times New Roman"/>
+        </w:rPr>
+      </w:pPr>
+      <w:r>
+        <w:rPr>
+          <w:i/>
+          <w:iCs/>
+        </w:rPr>
+        <w:t>Across and Down</w:t>
+      </w:r>
+      <w:r>
+        <w:t xml:space="preserve"> — in the </w:t>
+      </w:r>
+      <w:r>
+        <w:rPr>
+          <w:i/>
+          <w:iCs/>
+        </w:rPr>
+        <w:t>Grid Controls</w:t>
+      </w:r>
+      <w:r>
+        <w:t xml:space="preserve"> section of Setup (press </w:t>
+      </w:r>
+      <w:r>
+        <w:rPr>
+          <w:i/>
+          <w:iCs/>
+        </w:rPr>
+        <w:t>Settings</w:t>
+      </w:r>
+      <w:r>
+        <w:t xml:space="preserve">), set how many tiles </w:t>
+      </w:r>
+      <w:proofErr w:type="gramStart"/>
+      <w:r>
+        <w:t>wide</w:t>
+      </w:r>
+      <w:proofErr w:type="gramEnd"/>
+      <w:r>
+        <w:t xml:space="preserve"> and tall. The standard baseplate is 32 × 32, and that is the default. The readout shows the real size — 32 × 32 tiles </w:t>
+      </w:r>
+      <w:proofErr w:type="gramStart"/>
+      <w:r>
+        <w:t>is</w:t>
+      </w:r>
+      <w:proofErr w:type="gramEnd"/>
+      <w:r>
+        <w:t xml:space="preserve"> about 256 mm square. A new size takes effect when you press Enter or leave the field, not while you are still typing it. If a mosaic is already there, the tiles that still fit are carried across and any that fall outside are counted for you; </w:t>
+      </w:r>
+      <w:r>
+        <w:rPr>
+          <w:i/>
+          <w:iCs/>
+        </w:rPr>
+        <w:t>Ctrl-Z</w:t>
+      </w:r>
+      <w:r>
+        <w:t xml:space="preserve"> puts the old grid back.</w:t>
+      </w:r>
+    </w:p>
+    <w:p>
+      <w:pPr>
+        <w:pStyle w:val="ListParagraph"/>
+        <w:numPr>
+          <w:ilvl w:val="0"/>
+          <w:numId w:val="20"/>
+        </w:numPr>
+        <w:spacing w:after="60"/>
+        <w:contextualSpacing w:val="0"/>
+        <w:rPr>
+          <w:rFonts w:eastAsia="Times New Roman"/>
+        </w:rPr>
+      </w:pPr>
+      <w:r>
+        <w:rPr>
+          <w:i/>
+          <w:iCs/>
+        </w:rPr>
+        <w:t>Show</w:t>
+      </w:r>
+      <w:r>
+        <w:t xml:space="preserve"> — three checkboxes for what you see on the workspace: </w:t>
+      </w:r>
+      <w:r>
+        <w:rPr>
+          <w:rStyle w:val="Strong"/>
+          <w:rFonts w:eastAsia="Times New Roman"/>
+        </w:rPr>
+        <w:t>Grid</w:t>
+      </w:r>
+      <w:r>
+        <w:t xml:space="preserve"> (the cell lines and the row and column labels — numbers across the top, letters down the side — that you follow while building), </w:t>
+      </w:r>
+      <w:r>
+        <w:rPr>
+          <w:rStyle w:val="Strong"/>
+          <w:rFonts w:eastAsia="Times New Roman"/>
+        </w:rPr>
+        <w:t>Baseplate</w:t>
+      </w:r>
+      <w:r>
+        <w:t xml:space="preserve"> (the studded plate behind the tiles), and </w:t>
+      </w:r>
+      <w:r>
+        <w:rPr>
+          <w:rStyle w:val="Strong"/>
+          <w:rFonts w:eastAsia="Times New Roman"/>
+        </w:rPr>
+        <w:t>Box</w:t>
+      </w:r>
+      <w:r>
+        <w:t xml:space="preserve"> (the outline around the mosaic). Turn any of them off — turn all three off to see just the mosaic itself.</w:t>
+      </w:r>
+    </w:p>
+    <w:p>
+      <w:pPr>
+        <w:pStyle w:val="NormalWeb"/>
+        <w:spacing w:beforeAutospacing="0" w:afterAutospacing="0"/>
+      </w:pPr>
+      <w:r>
+        <w:t xml:space="preserve">Fewer tiles across make bigger, blockier tiles and a coarser picture; more </w:t>
+      </w:r>
+      <w:proofErr w:type="gramStart"/>
+      <w:r>
+        <w:t>make</w:t>
+      </w:r>
+      <w:proofErr w:type="gramEnd"/>
+      <w:r>
+        <w:t xml:space="preserve"> a finer picture that needs more, smaller tiles.</w:t>
+      </w:r>
+    </w:p>
+    <w:p>
+      <w:pPr>
+        <w:pStyle w:val="Heading2"/>
+        <w:rPr>
+          <w:rFonts w:eastAsia="Times New Roman"/>
+        </w:rPr>
+      </w:pPr>
+      <w:bookmarkStart w:id="5" w:name="_Toc236986553"/>
+      <w:r>
+        <w:rPr>
+          <w:rFonts w:eastAsia="Times New Roman"/>
+        </w:rPr>
+        <w:t>6. Build It!</w:t>
+      </w:r>
+      <w:bookmarkEnd w:id="5"/>
+    </w:p>
+    <w:p>
+      <w:pPr>
+        <w:pStyle w:val="NormalWeb"/>
+        <w:spacing w:beforeAutospacing="0" w:afterAutospacing="0"/>
+      </w:pPr>
+      <w:r>
+        <w:t xml:space="preserve">Press the green </w:t>
+      </w:r>
+      <w:r>
+        <w:rPr>
+          <w:rStyle w:val="Strong"/>
+          <w:rFonts w:eastAsia="Times New Roman"/>
+        </w:rPr>
+        <w:t>Build It!</w:t>
+      </w:r>
+      <w:r>
+        <w:t xml:space="preserve"> button and Sangala maps the framed picture to your palette colors, cell by cell, and shows the result on its baseplate. </w:t>
+      </w:r>
+      <w:r>
+        <w:rPr>
+          <w:rStyle w:val="Strong"/>
+          <w:rFonts w:eastAsia="Times New Roman"/>
+        </w:rPr>
+        <w:t>Transparent</w:t>
+      </w:r>
+      <w:r>
+        <w:t xml:space="preserve"> lets you check it against the photo. Building again over a same-size mosaic is one undo step — Ctrl-Z brings the previous mosaic back.</w:t>
       </w:r>
     </w:p>
     <w:p>
@@ -3088,167 +2576,17 @@
         <w:keepNext/>
         <w:spacing w:before="120"/>
         <w:jc w:val="center"/>
-        <w:rPr>
-          <w:ins w:id="3520" w:author="Figures" w:date="2026-08-10T00:00:00Z"/>
-        </w:rPr>
-      </w:pPr>
-      <w:ins w:id="3020" w:author="Figures" w:date="2026-08-10T00:00:00Z">
-        <w:r>
-          <w:rPr>
-            <w:noProof/>
-          </w:rPr>
-          <w:drawing>
-            <wp:inline distT="0" distB="0" distL="0" distR="0">
-              <wp:extent cx="4754880" cy="2194560"/>
-              <wp:effectExtent l="0" t="0" r="0" b="0"/>
-              <wp:docPr id="2002" name="Figure2002"/>
-              <wp:cNvGraphicFramePr>
-                <a:graphicFrameLocks xmlns:a="http://schemas.openxmlformats.org/drawingml/2006/main" noChangeAspect="1"/>
-              </wp:cNvGraphicFramePr>
-              <a:graphic xmlns:a="http://schemas.openxmlformats.org/drawingml/2006/main">
-                <a:graphicData uri="http://schemas.openxmlformats.org/drawingml/2006/picture">
-                  <pic:pic xmlns:pic="http://schemas.openxmlformats.org/drawingml/2006/picture">
-                    <pic:nvPicPr>
-                      <pic:cNvPr id="2002" name="Figure2002.png"/>
-                      <pic:cNvPicPr/>
-                    </pic:nvPicPr>
-                    <pic:blipFill>
-                      <a:blip r:embed="rId20"/>
-                      <a:stretch>
-                        <a:fillRect/>
-                      </a:stretch>
-                    </pic:blipFill>
-                    <pic:spPr>
-                      <a:xfrm>
-                        <a:off x="0" y="0"/>
-                        <a:ext cx="4754880" cy="2194560"/>
-                      </a:xfrm>
-                      <a:prstGeom prst="rect">
-                        <a:avLst/>
-                      </a:prstGeom>
-                    </pic:spPr>
-                  </pic:pic>
-                </a:graphicData>
-              </a:graphic>
-            </wp:inline>
-          </w:drawing>
-        </w:r>
-      </w:ins>
-    </w:p>
-    <w:p>
-      <w:pPr>
-        <w:spacing w:before="60" w:after="120"/>
-        <w:jc w:val="center"/>
-        <w:rPr>
-          <w:ins w:id="3525" w:author="Figures" w:date="2026-08-10T00:00:00Z"/>
-        </w:rPr>
-      </w:pPr>
-      <w:ins w:id="3025" w:author="Figures" w:date="2026-08-10T00:00:00Z">
-        <w:r>
-          <w:rPr>
-            <w:i/>
-            <w:iCs/>
-          </w:rPr>
-          <w:t xml:space="preserve">Figure 7. The same mosaic drawn as tiles, as dots, and as beads.</w:t>
-        </w:r>
-      </w:ins>
-    </w:p>
-    <w:p>
-      <w:pPr>
-        <w:pStyle w:val="Heading2"/>
-        <w:rPr>
-          <w:rFonts w:eastAsia="Times New Roman"/>
-        </w:rPr>
-      </w:pPr>
-      <w:bookmarkStart w:id="8" w:name="_Toc236986556"/>
-      <w:r>
-        <w:rPr>
-          <w:rFonts w:eastAsia="Times New Roman"/>
-        </w:rPr>
-        <w:t>9. Seeing the mosaic</w:t>
-      </w:r>
-      <w:bookmarkEnd w:id="8"/>
-    </w:p>
-    <w:p>
-      <w:pPr>
-        <w:pStyle w:val="NormalWeb"/>
-        <w:spacing w:before="0" w:beforeAutospacing="0" w:after="60" w:afterAutospacing="0"/>
-      </w:pPr>
-      <w:r>
-        <w:t>The mosaic sits in the grid, so it is always on screen. Two ways to compare it with the photo:</w:t>
-      </w:r>
-    </w:p>
-    <w:p>
-      <w:pPr>
-        <w:pStyle w:val="ListParagraph"/>
-        <w:numPr>
-          <w:ilvl w:val="0"/>
-          <w:numId w:val="19"/>
-        </w:numPr>
-        <w:spacing w:after="60"/>
-        <w:contextualSpacing w:val="0"/>
-        <w:rPr>
-          <w:rFonts w:eastAsia="Times New Roman"/>
-        </w:rPr>
-      </w:pPr>
-      <w:r>
-        <w:rPr>
-          <w:rStyle w:val="Strong"/>
-          <w:rFonts w:eastAsia="Times New Roman"/>
+      </w:pPr>
+      <w:r>
+        <w:rPr>
+          <w:noProof/>
         </w:rPr>
         <w:lastRenderedPageBreak/>
-        <w:t>Side by side</w:t>
-      </w:r>
-      <w:r>
-        <w:t xml:space="preserve"> — the workspace stays live, so </w:t>
-      </w:r>
-      <w:r>
-        <w:rPr>
-          <w:rStyle w:val="Strong"/>
-          <w:rFonts w:eastAsia="Times New Roman"/>
-        </w:rPr>
-        <w:t>Open</w:t>
-      </w:r>
-      <w:r>
-        <w:t xml:space="preserve"> a copy of the photo and drag it beside the mosaic; adding or moving it never disturbs the mosaic.</w:t>
-      </w:r>
-    </w:p>
-    <w:p>
-      <w:pPr>
-        <w:pStyle w:val="ListParagraph"/>
-        <w:numPr>
-          <w:ilvl w:val="0"/>
-          <w:numId w:val="19"/>
-        </w:numPr>
-        <w:spacing w:after="60"/>
-        <w:contextualSpacing w:val="0"/>
-        <w:rPr>
-          <w:rFonts w:eastAsia="Times New Roman"/>
-        </w:rPr>
-      </w:pPr>
-      <w:r>
-        <w:rPr>
-          <w:rStyle w:val="Strong"/>
-          <w:rFonts w:eastAsia="Times New Roman"/>
-        </w:rPr>
-        <w:t>Transparent — make the tiles translucent so the photo shows through underneath. It stays available while painting (Section 10). The Transparency slider (in Adjust Mosaic, shown while Transparent is on) sets how much photo shows through; the setting saves with the project.</w:t>
-      </w:r>
-    </w:p>
-    <w:p>
-      <w:pPr>
-        <w:keepNext/>
-        <w:spacing w:before="120"/>
-        <w:jc w:val="center"/>
-      </w:pPr>
-      <w:r>
-        <w:rPr>
-          <w:noProof/>
-        </w:rPr>
         <w:drawing>
-          <wp:inline distT="0" distB="0" distL="0" distR="0" wp14:anchorId="7429AC2A" wp14:editId="7DBECAAE">
+          <wp:inline distT="0" distB="0" distL="0" distR="0" wp14:anchorId="26B257E6" wp14:editId="22E2DC49">
             <wp:extent cx="3017520" cy="2984464"/>
             <wp:effectExtent l="0" t="0" r="0" b="0"/>
-            <wp:docPr id="1004" name="Figure4"/>
+            <wp:docPr id="1002" name="Figure2"/>
             <wp:cNvGraphicFramePr>
               <a:graphicFrameLocks xmlns:a="http://schemas.openxmlformats.org/drawingml/2006/main" noChangeAspect="1"/>
             </wp:cNvGraphicFramePr>
@@ -3256,7 +2594,7 @@
               <a:graphicData uri="http://schemas.openxmlformats.org/drawingml/2006/picture">
                 <pic:pic xmlns:pic="http://schemas.openxmlformats.org/drawingml/2006/picture">
                   <pic:nvPicPr>
-                    <pic:cNvPr id="1004" name="Figure4.png"/>
+                    <pic:cNvPr id="1002" name="Figure2.png"/>
                     <pic:cNvPicPr/>
                   </pic:nvPicPr>
                   <pic:blipFill>
@@ -3286,47 +2624,20 @@
         <w:spacing w:before="60" w:after="120"/>
         <w:jc w:val="center"/>
       </w:pPr>
-      <w:del w:id="1009" w:author="Figures" w:date="2026-08-10T00:00:00Z">
-        <w:r>
-          <w:rPr>
-            <w:i/>
-            <w:iCs/>
-          </w:rPr>
-          <w:delText xml:space="preserve">Figure 5.</w:delText>
-        </w:r>
-      </w:del>
-      <w:ins w:id="1010" w:author="Figures" w:date="2026-08-10T00:00:00Z">
-        <w:r>
-          <w:rPr>
-            <w:i/>
-            <w:iCs/>
-          </w:rPr>
-          <w:t xml:space="preserve">Figure 8.</w:t>
-        </w:r>
-      </w:ins>
       <w:r>
         <w:rPr>
           <w:i/>
           <w:iCs/>
         </w:rPr>
-        <w:t xml:space="preserve"> Transparent makes the tiles translucent so the photo shows through.</w:t>
-      </w:r>
-    </w:p>
-    <w:p>
-      <w:pPr>
-        <w:pStyle w:val="Heading2"/>
-        <w:rPr>
-          <w:rFonts w:eastAsia="Times New Roman"/>
-        </w:rPr>
-      </w:pPr>
-      <w:bookmarkStart w:id="9" w:name="_Toc236986557"/>
-      <w:r>
-        <w:rPr>
-          <w:rFonts w:eastAsia="Times New Roman"/>
-        </w:rPr>
-        <w:t>10. Editing tiles by hand: Paint, Pick, Erase</w:t>
-      </w:r>
-      <w:bookmarkEnd w:id="9"/>
+        <w:t>Figure 4.</w:t>
+      </w:r>
+      <w:r>
+        <w:rPr>
+          <w:i/>
+          <w:iCs/>
+        </w:rPr>
+        <w:t xml:space="preserve"> The finished mosaic on its baseplate.</w:t>
+      </w:r>
     </w:p>
     <w:p>
       <w:pPr>
@@ -3334,7 +2645,15 @@
         <w:spacing w:before="0" w:beforeAutospacing="0" w:after="60" w:afterAutospacing="0"/>
       </w:pPr>
       <w:r>
-        <w:t>Three tools on the left rail edit individual cells. They do not wait for a build: choosing one with nothing open starts an empty mosaic at the current grid size, so a design can be drawn tile by tile from the beginning. When to start a mosaic is your decision, not the program's.</w:t>
+        <w:t xml:space="preserve">Two controls in Adjust Mosaic set how the photo is </w:t>
+      </w:r>
+      <w:proofErr w:type="gramStart"/>
+      <w:r>
+        <w:t>mapped, and</w:t>
+      </w:r>
+      <w:proofErr w:type="gramEnd"/>
+      <w:r>
+        <w:t xml:space="preserve"> apply at the next Build It!:</w:t>
       </w:r>
     </w:p>
     <w:p>
@@ -3355,10 +2674,10 @@
           <w:rStyle w:val="Strong"/>
           <w:rFonts w:eastAsia="Times New Roman"/>
         </w:rPr>
-        <w:t>Paint</w:t>
-      </w:r>
-      <w:r>
-        <w:t xml:space="preserve"> — click a color in the palette, then click or drag across cells to set them to that color. Hold Shift to erase instead, and release it to paint again, so a correction in the middle of a stroke needs no trip back to the tool rail. Right-click a cell to clear it.</w:t>
+        <w:t>Ignore the background</w:t>
+      </w:r>
+      <w:r>
+        <w:t xml:space="preserve"> (on by default) — treats the removed or empty background as empty cells, so thin parts like legs survive instead of being outvoted by a sea of sky.</w:t>
       </w:r>
     </w:p>
     <w:p>
@@ -3379,10 +2698,35 @@
           <w:rStyle w:val="Strong"/>
           <w:rFonts w:eastAsia="Times New Roman"/>
         </w:rPr>
-        <w:t>Pick</w:t>
-      </w:r>
-      <w:r>
-        <w:t xml:space="preserve"> — click a cell to grab its color, then keep painting with it.</w:t>
+        <w:t>Clean up stray tiles</w:t>
+      </w:r>
+      <w:r>
+        <w:t xml:space="preserve"> — gently </w:t>
+      </w:r>
+      <w:proofErr w:type="gramStart"/>
+      <w:r>
+        <w:t>fills</w:t>
+      </w:r>
+      <w:proofErr w:type="gramEnd"/>
+      <w:r>
+        <w:t xml:space="preserve"> single-tile holes and </w:t>
+      </w:r>
+      <w:proofErr w:type="gramStart"/>
+      <w:r>
+        <w:t>drops</w:t>
+      </w:r>
+      <w:proofErr w:type="gramEnd"/>
+      <w:r>
+        <w:t xml:space="preserve"> lone stray tiles, so the mosaic reads cleanly without erasing real detail.</w:t>
+      </w:r>
+    </w:p>
+    <w:p>
+      <w:pPr>
+        <w:pStyle w:val="NormalWeb"/>
+        <w:spacing w:before="0" w:beforeAutospacing="0" w:after="60" w:afterAutospacing="0"/>
+      </w:pPr>
+      <w:r>
+        <w:t>The other three adjust the mosaic as it stands: every filled cell is re-mapped from its own source color — hand-placed tiles included. Filled cells stay filled, empty cells stay empty, and each slider gesture is one undo step:</w:t>
       </w:r>
     </w:p>
     <w:p>
@@ -3403,91 +2747,10 @@
           <w:rStyle w:val="Strong"/>
           <w:rFonts w:eastAsia="Times New Roman"/>
         </w:rPr>
-        <w:t>Erase</w:t>
-      </w:r>
-      <w:r>
-        <w:t xml:space="preserve"> — click or drag to clear cells back to empty (the baseplate shows through).</w:t>
-      </w:r>
-    </w:p>
-    <w:p>
-      <w:pPr>
-        <w:pStyle w:val="NormalWeb"/>
-        <w:spacing w:beforeAutospacing="0" w:afterAutospacing="0"/>
-      </w:pPr>
-      <w:r>
-        <w:rPr>
-          <w:i/>
-          <w:iCs/>
-        </w:rPr>
-        <w:t>Undo is there.</w:t>
-      </w:r>
-      <w:r>
-        <w:t xml:space="preserve"> </w:t>
-      </w:r>
-      <w:r>
-        <w:rPr>
-          <w:i/>
-          <w:iCs/>
-        </w:rPr>
-        <w:t>Ctrl-Z</w:t>
-      </w:r>
-      <w:r>
-        <w:t xml:space="preserve"> undoes your last stroke — a whole dragged line comes back in one press — and </w:t>
-      </w:r>
-      <w:r>
-        <w:rPr>
-          <w:i/>
-          <w:iCs/>
-        </w:rPr>
-        <w:t>Ctrl-Y</w:t>
-      </w:r>
-      <w:r>
-        <w:t xml:space="preserve"> (or </w:t>
-      </w:r>
-      <w:r>
-        <w:rPr>
-          <w:i/>
-          <w:iCs/>
-        </w:rPr>
-        <w:t>Ctrl-Shift-Z</w:t>
-      </w:r>
-      <w:r>
-        <w:t>) redoes it. Changing the grid size is a single step of its own, so that too can be undone. Building again over the photo replaces what is there, as does changing the photo itself.</w:t>
-      </w:r>
-    </w:p>
-    <w:p>
-      <w:pPr>
-        <w:pStyle w:val="Heading2"/>
-        <w:rPr>
-          <w:rFonts w:eastAsia="Times New Roman"/>
-        </w:rPr>
-      </w:pPr>
-      <w:bookmarkStart w:id="10" w:name="_Toc236986558"/>
-      <w:r>
-        <w:rPr>
-          <w:rFonts w:eastAsia="Times New Roman"/>
-        </w:rPr>
-        <w:t>11. Grouping tiles into parts</w:t>
-      </w:r>
-      <w:bookmarkEnd w:id="10"/>
-    </w:p>
-    <w:p>
-      <w:pPr>
-        <w:pStyle w:val="NormalWeb"/>
-        <w:spacing w:before="0" w:beforeAutospacing="0" w:after="60" w:afterAutospacing="0"/>
-      </w:pPr>
-      <w:r>
-        <w:t xml:space="preserve">Any group of tiles — a head, a leg, any region — can be selected and assigned a name. After a build, select tiles and </w:t>
-      </w:r>
-      <w:r>
-        <w:rPr>
-          <w:i/>
-          <w:iCs/>
-        </w:rPr>
-        <w:t>Group</w:t>
-      </w:r>
-      <w:r>
-        <w:t xml:space="preserve"> them:</w:t>
+        <w:t>Colors</w:t>
+      </w:r>
+      <w:r>
+        <w:t xml:space="preserve"> — how many different tile colors to reduce the picture to. A low number gives a bolder, simpler mosaic; a high number gives more shading. Sangala always snaps these to the nearest palette colors.</w:t>
       </w:r>
     </w:p>
     <w:p>
@@ -3505,13 +2768,23 @@
       </w:pPr>
       <w:r>
         <w:rPr>
-          <w:i/>
-          <w:iCs/>
-        </w:rPr>
-        <w:t>Select Area</w:t>
-      </w:r>
-      <w:r>
-        <w:t xml:space="preserve"> — drag a box to select the tiles inside it, whatever color they are.</w:t>
+          <w:rStyle w:val="Strong"/>
+          <w:rFonts w:eastAsia="Times New Roman"/>
+        </w:rPr>
+        <w:t>Contrast</w:t>
+      </w:r>
+      <w:r>
+        <w:t xml:space="preserve"> and </w:t>
+      </w:r>
+      <w:r>
+        <w:rPr>
+          <w:rStyle w:val="Strong"/>
+          <w:rFonts w:eastAsia="Times New Roman"/>
+        </w:rPr>
+        <w:t>Brightness</w:t>
+      </w:r>
+      <w:r>
+        <w:t xml:space="preserve"> — shift every filled cell’s color, darker, lighter, or further apart, before it snaps to the nearest palette color.</w:t>
       </w:r>
     </w:p>
     <w:p>
@@ -3529,23 +2802,234 @@
       </w:pPr>
       <w:r>
         <w:rPr>
+          <w:rStyle w:val="Strong"/>
+          <w:rFonts w:eastAsia="Times New Roman"/>
+        </w:rPr>
+        <w:t>Clear Mosaic</w:t>
+      </w:r>
+      <w:r>
+        <w:t xml:space="preserve"> — empties every cell as one undo step. Photos, palette, grid, and parts stay.</w:t>
+      </w:r>
+    </w:p>
+    <w:p>
+      <w:pPr>
+        <w:pStyle w:val="NormalWeb"/>
+        <w:spacing w:beforeAutospacing="0" w:afterAutospacing="0"/>
+      </w:pPr>
+      <w:r>
+        <w:t>Cells can also be edited one at a time with the hand tools (Section 10).</w:t>
+      </w:r>
+    </w:p>
+    <w:p>
+      <w:pPr>
+        <w:pStyle w:val="Heading2"/>
+        <w:rPr>
+          <w:rFonts w:eastAsia="Times New Roman"/>
+        </w:rPr>
+      </w:pPr>
+      <w:bookmarkStart w:id="6" w:name="_Toc236986554"/>
+      <w:r>
+        <w:rPr>
+          <w:rFonts w:eastAsia="Times New Roman"/>
+        </w:rPr>
+        <w:t>7. Line art: rendering a drawing</w:t>
+      </w:r>
+      <w:bookmarkEnd w:id="6"/>
+    </w:p>
+    <w:p>
+      <w:pPr>
+        <w:pStyle w:val="NormalWeb"/>
+        <w:spacing w:before="0" w:beforeAutospacing="0" w:after="60" w:afterAutospacing="0"/>
+      </w:pPr>
+      <w:r>
+        <w:t>Sample as line art (in Adjust Mosaic) suits a drawing rather than a photograph. Every cell is judged to be line, color, or paper: a cell mostly covered by ink takes Black, a cell carrying color takes that color, and a cell with neither is left empty, so the paper of the drawing becomes bare baseplate. With the setting off, a cell instead takes the average of the pixels beneath it, and a cell straddling an ink line averages ink and paper together into a gray that appears nowhere in the drawing.</w:t>
+      </w:r>
+    </w:p>
+    <w:p>
+      <w:pPr>
+        <w:keepNext/>
+        <w:spacing w:before="120"/>
+        <w:jc w:val="center"/>
+      </w:pPr>
+      <w:r>
+        <w:rPr>
+          <w:noProof/>
+        </w:rPr>
+        <w:lastRenderedPageBreak/>
+        <w:drawing>
+          <wp:inline distT="0" distB="0" distL="0" distR="0" wp14:anchorId="41455620" wp14:editId="1C05D468">
+            <wp:extent cx="5394960" cy="1888991"/>
+            <wp:effectExtent l="0" t="0" r="0" b="0"/>
+            <wp:docPr id="178688822" name="Figure1"/>
+            <wp:cNvGraphicFramePr>
+              <a:graphicFrameLocks xmlns:a="http://schemas.openxmlformats.org/drawingml/2006/main" noChangeAspect="1"/>
+            </wp:cNvGraphicFramePr>
+            <a:graphic xmlns:a="http://schemas.openxmlformats.org/drawingml/2006/main">
+              <a:graphicData uri="http://schemas.openxmlformats.org/drawingml/2006/picture">
+                <pic:pic xmlns:pic="http://schemas.openxmlformats.org/drawingml/2006/picture">
+                  <pic:nvPicPr>
+                    <pic:cNvPr id="1001" name="Figure1.png"/>
+                    <pic:cNvPicPr/>
+                  </pic:nvPicPr>
+                  <pic:blipFill>
+                    <a:blip r:embed="rId14"/>
+                    <a:stretch>
+                      <a:fillRect/>
+                    </a:stretch>
+                  </pic:blipFill>
+                  <pic:spPr>
+                    <a:xfrm>
+                      <a:off x="0" y="0"/>
+                      <a:ext cx="5394960" cy="1888991"/>
+                    </a:xfrm>
+                    <a:prstGeom prst="rect">
+                      <a:avLst/>
+                    </a:prstGeom>
+                  </pic:spPr>
+                </pic:pic>
+              </a:graphicData>
+            </a:graphic>
+          </wp:inline>
+        </w:drawing>
+      </w:r>
+    </w:p>
+    <w:p>
+      <w:pPr>
+        <w:spacing w:before="60" w:after="120"/>
+        <w:jc w:val="center"/>
+      </w:pPr>
+      <w:r>
+        <w:rPr>
           <w:i/>
           <w:iCs/>
         </w:rPr>
-        <w:t>Wand</w:t>
-      </w:r>
-      <w:r>
-        <w:t xml:space="preserve"> — click a tile to select the whole connected run of that color. The </w:t>
+        <w:t>Figure 5.</w:t>
       </w:r>
       <w:r>
         <w:rPr>
           <w:i/>
           <w:iCs/>
         </w:rPr>
-        <w:t>Similar Colors</w:t>
-      </w:r>
-      <w:r>
-        <w:t xml:space="preserve"> slider (shown while the Wand is active) lets nearby colors join the run — at 0, only the exact color; moving it re-grows the last clicked run.</w:t>
+        <w:t xml:space="preserve"> The same drawing averaged, and with Sample as line art on.</w:t>
+      </w:r>
+    </w:p>
+    <w:p>
+      <w:pPr>
+        <w:pStyle w:val="NormalWeb"/>
+        <w:spacing w:before="0" w:beforeAutospacing="0" w:after="60" w:afterAutospacing="0"/>
+      </w:pPr>
+      <w:r>
+        <w:t>The line is drawn in Black. If Black is switched off in the palette, the status line names the color used in its place. Line art works with any medium; in Dots the drawing reads as marks on paper, which is closest to how it was made.</w:t>
+      </w:r>
+    </w:p>
+    <w:p>
+      <w:pPr>
+        <w:keepNext/>
+        <w:spacing w:before="120"/>
+        <w:jc w:val="center"/>
+      </w:pPr>
+      <w:r>
+        <w:rPr>
+          <w:noProof/>
+        </w:rPr>
+        <w:drawing>
+          <wp:inline distT="0" distB="0" distL="0" distR="0" wp14:anchorId="41455620" wp14:editId="1C05D468">
+            <wp:extent cx="5669280" cy="1839760"/>
+            <wp:effectExtent l="0" t="0" r="0" b="0"/>
+            <wp:docPr id="1877548301" name="Figure1"/>
+            <wp:cNvGraphicFramePr>
+              <a:graphicFrameLocks xmlns:a="http://schemas.openxmlformats.org/drawingml/2006/main" noChangeAspect="1"/>
+            </wp:cNvGraphicFramePr>
+            <a:graphic xmlns:a="http://schemas.openxmlformats.org/drawingml/2006/main">
+              <a:graphicData uri="http://schemas.openxmlformats.org/drawingml/2006/picture">
+                <pic:pic xmlns:pic="http://schemas.openxmlformats.org/drawingml/2006/picture">
+                  <pic:nvPicPr>
+                    <pic:cNvPr id="1001" name="Figure1.png"/>
+                    <pic:cNvPicPr/>
+                  </pic:nvPicPr>
+                  <pic:blipFill>
+                    <a:blip r:embed="rId15"/>
+                    <a:stretch>
+                      <a:fillRect/>
+                    </a:stretch>
+                  </pic:blipFill>
+                  <pic:spPr>
+                    <a:xfrm>
+                      <a:off x="0" y="0"/>
+                      <a:ext cx="5669280" cy="1839760"/>
+                    </a:xfrm>
+                    <a:prstGeom prst="rect">
+                      <a:avLst/>
+                    </a:prstGeom>
+                  </pic:spPr>
+                </pic:pic>
+              </a:graphicData>
+            </a:graphic>
+          </wp:inline>
+        </w:drawing>
+      </w:r>
+    </w:p>
+    <w:p>
+      <w:pPr>
+        <w:spacing w:before="60" w:after="120"/>
+        <w:jc w:val="center"/>
+      </w:pPr>
+      <w:r>
+        <w:rPr>
+          <w:i/>
+          <w:iCs/>
+        </w:rPr>
+        <w:t>Figure 6.</w:t>
+      </w:r>
+      <w:r>
+        <w:rPr>
+          <w:i/>
+          <w:iCs/>
+        </w:rPr>
+        <w:t xml:space="preserve"> A drawing rendered as dots, beside its source.</w:t>
+      </w:r>
+    </w:p>
+    <w:p>
+      <w:pPr>
+        <w:pStyle w:val="Heading2"/>
+        <w:rPr>
+          <w:rFonts w:eastAsia="Times New Roman"/>
+        </w:rPr>
+      </w:pPr>
+      <w:bookmarkStart w:id="7" w:name="_Toc236986555"/>
+      <w:r>
+        <w:rPr>
+          <w:rFonts w:eastAsia="Times New Roman"/>
+        </w:rPr>
+        <w:t>8. The medium: tiles, dots, and beads</w:t>
+      </w:r>
+      <w:bookmarkEnd w:id="7"/>
+    </w:p>
+    <w:p>
+      <w:pPr>
+        <w:pStyle w:val="NormalWeb"/>
+        <w:spacing w:before="0" w:beforeAutospacing="0" w:after="60" w:afterAutospacing="0"/>
+      </w:pPr>
+      <w:r>
+        <w:t xml:space="preserve">The built mosaic sits on a </w:t>
+      </w:r>
+      <w:r>
+        <w:rPr>
+          <w:rStyle w:val="Strong"/>
+          <w:rFonts w:eastAsia="Times New Roman"/>
+        </w:rPr>
+        <w:t>baseplate</w:t>
+      </w:r>
+      <w:r>
+        <w:t xml:space="preserve"> — the studded plate the tiles snap </w:t>
+      </w:r>
+      <w:proofErr w:type="gramStart"/>
+      <w:r>
+        <w:t>onto —</w:t>
+      </w:r>
+      <w:proofErr w:type="gramEnd"/>
+      <w:r>
+        <w:t xml:space="preserve"> so you see it the way it will really look.</w:t>
       </w:r>
     </w:p>
     <w:p>
@@ -3563,34 +3047,43 @@
       </w:pPr>
       <w:r>
         <w:rPr>
+          <w:rStyle w:val="Strong"/>
+          <w:rFonts w:eastAsia="Times New Roman"/>
+        </w:rPr>
+        <w:t>Baseplate color</w:t>
+      </w:r>
+      <w:r>
+        <w:t xml:space="preserve"> — choose from the </w:t>
+      </w:r>
+      <w:r>
+        <w:rPr>
           <w:i/>
           <w:iCs/>
         </w:rPr>
-        <w:lastRenderedPageBreak/>
-        <w:t>Shift</w:t>
-      </w:r>
-      <w:r>
-        <w:t xml:space="preserve">-click adds or drops a single tile; </w:t>
+        <w:t>Baseplate</w:t>
+      </w:r>
+      <w:r>
+        <w:t xml:space="preserve"> swatches in Setup (press </w:t>
       </w:r>
       <w:r>
         <w:rPr>
           <w:i/>
           <w:iCs/>
         </w:rPr>
-        <w:t>Alt</w:t>
-      </w:r>
-      <w:r>
-        <w:t xml:space="preserve"> removes; </w:t>
-      </w:r>
-      <w:r>
-        <w:rPr>
-          <w:i/>
-          <w:iCs/>
-        </w:rPr>
-        <w:t>Ctrl-D</w:t>
-      </w:r>
-      <w:r>
-        <w:t xml:space="preserve"> deselects. The three selection tools all feed one selection, so mix them freely.</w:t>
+        <w:t>Settings</w:t>
+      </w:r>
+      <w:r>
+        <w:t xml:space="preserve">). These are limited to the colors LEGO actually sells baseplates in (White, Green, Gray, Blue, Sand (Tan), Black, Red, and Light Blue). </w:t>
+      </w:r>
+      <w:r>
+        <w:rPr>
+          <w:rStyle w:val="Strong"/>
+          <w:rFonts w:eastAsia="Times New Roman"/>
+        </w:rPr>
+        <w:t>White</w:t>
+      </w:r>
+      <w:r>
+        <w:t xml:space="preserve"> is the default.</w:t>
       </w:r>
     </w:p>
     <w:p>
@@ -3608,33 +3101,170 @@
       </w:pPr>
       <w:r>
         <w:rPr>
+          <w:rStyle w:val="Strong"/>
+          <w:rFonts w:eastAsia="Times New Roman"/>
+        </w:rPr>
+        <w:t>Show or hide</w:t>
+      </w:r>
+      <w:r>
+        <w:t xml:space="preserve"> — the </w:t>
+      </w:r>
+      <w:r>
+        <w:rPr>
+          <w:rStyle w:val="Strong"/>
+          <w:rFonts w:eastAsia="Times New Roman"/>
+        </w:rPr>
+        <w:t>Baseplate</w:t>
+      </w:r>
+      <w:r>
+        <w:t xml:space="preserve"> checkbox hides the plate for a clean, chart-like view of just the tiles (handy for reading the pattern). With the plate shown, the studs mark the grid; hide it and the cell lines return so empty cells stay clear.</w:t>
+      </w:r>
+    </w:p>
+    <w:p>
+      <w:pPr>
+        <w:pStyle w:val="NormalWeb"/>
+        <w:spacing w:before="0" w:beforeAutospacing="0" w:after="60" w:afterAutospacing="0"/>
+      </w:pPr>
+      <w:r>
+        <w:rPr>
           <w:i/>
           <w:iCs/>
         </w:rPr>
-        <w:t>Group</w:t>
-      </w:r>
-      <w:r>
-        <w:t xml:space="preserve"> turns the selection into a named part. </w:t>
-      </w:r>
+        <w:t xml:space="preserve">Medium (in Setup) chooses how the mosaic is drawn. Tiles </w:t>
+      </w:r>
+      <w:proofErr w:type="gramStart"/>
       <w:r>
         <w:rPr>
           <w:i/>
           <w:iCs/>
         </w:rPr>
-        <w:t>Select</w:t>
-      </w:r>
-      <w:r>
-        <w:t xml:space="preserve"> (the arrow) reselects a part with one click; change its tiles and the button reads </w:t>
-      </w:r>
+        <w:t>is</w:t>
+      </w:r>
+      <w:proofErr w:type="gramEnd"/>
       <w:r>
         <w:rPr>
           <w:i/>
           <w:iCs/>
         </w:rPr>
-        <w:t>Update Part</w:t>
-      </w:r>
-      <w:r>
-        <w:t xml:space="preserve"> — press it to keep the change.</w:t>
+        <w:t xml:space="preserve"> square LEGO tiles on the studded baseplate; Dots </w:t>
+      </w:r>
+      <w:proofErr w:type="gramStart"/>
+      <w:r>
+        <w:rPr>
+          <w:i/>
+          <w:iCs/>
+        </w:rPr>
+        <w:t>is</w:t>
+      </w:r>
+      <w:proofErr w:type="gramEnd"/>
+      <w:r>
+        <w:rPr>
+          <w:i/>
+          <w:iCs/>
+        </w:rPr>
+        <w:t xml:space="preserve"> dot stickers, or marker dots, on poster paper; Beads </w:t>
+      </w:r>
+      <w:proofErr w:type="gramStart"/>
+      <w:r>
+        <w:rPr>
+          <w:i/>
+          <w:iCs/>
+        </w:rPr>
+        <w:t>is</w:t>
+      </w:r>
+      <w:proofErr w:type="gramEnd"/>
+      <w:r>
+        <w:rPr>
+          <w:i/>
+          <w:iCs/>
+        </w:rPr>
+        <w:t xml:space="preserve"> round beads on a plain tray. For Dots and Beads the Baseplate color is that surface and shows between the elements; only Tiles has studs, so with Grid on the cell lines show. The palette is named for the medium — Tile Colors, Dot Colors, or Bead Colors — and Dots offers sixteen colors the others do not. The choice carries through the workspace, the saved image, and the printed sheet, and saves with the project.</w:t>
+      </w:r>
+    </w:p>
+    <w:p>
+      <w:pPr>
+        <w:keepNext/>
+        <w:spacing w:before="120"/>
+        <w:jc w:val="center"/>
+      </w:pPr>
+      <w:r>
+        <w:rPr>
+          <w:noProof/>
+        </w:rPr>
+        <w:lastRenderedPageBreak/>
+        <w:drawing>
+          <wp:inline distT="0" distB="0" distL="0" distR="0" wp14:anchorId="45D80F73" wp14:editId="0CD58B04">
+            <wp:extent cx="4754880" cy="2194560"/>
+            <wp:effectExtent l="0" t="0" r="0" b="0"/>
+            <wp:docPr id="2002" name="Figure2002"/>
+            <wp:cNvGraphicFramePr>
+              <a:graphicFrameLocks xmlns:a="http://schemas.openxmlformats.org/drawingml/2006/main" noChangeAspect="1"/>
+            </wp:cNvGraphicFramePr>
+            <a:graphic xmlns:a="http://schemas.openxmlformats.org/drawingml/2006/main">
+              <a:graphicData uri="http://schemas.openxmlformats.org/drawingml/2006/picture">
+                <pic:pic xmlns:pic="http://schemas.openxmlformats.org/drawingml/2006/picture">
+                  <pic:nvPicPr>
+                    <pic:cNvPr id="2002" name="Figure2002.png"/>
+                    <pic:cNvPicPr/>
+                  </pic:nvPicPr>
+                  <pic:blipFill>
+                    <a:blip r:embed="rId16"/>
+                    <a:stretch>
+                      <a:fillRect/>
+                    </a:stretch>
+                  </pic:blipFill>
+                  <pic:spPr>
+                    <a:xfrm>
+                      <a:off x="0" y="0"/>
+                      <a:ext cx="4754880" cy="2194560"/>
+                    </a:xfrm>
+                    <a:prstGeom prst="rect">
+                      <a:avLst/>
+                    </a:prstGeom>
+                  </pic:spPr>
+                </pic:pic>
+              </a:graphicData>
+            </a:graphic>
+          </wp:inline>
+        </w:drawing>
+      </w:r>
+    </w:p>
+    <w:p>
+      <w:pPr>
+        <w:spacing w:before="60" w:after="120"/>
+        <w:jc w:val="center"/>
+      </w:pPr>
+      <w:r>
+        <w:rPr>
+          <w:i/>
+          <w:iCs/>
+        </w:rPr>
+        <w:t>Figure 7. The same mosaic drawn as tiles, as dots, and as beads.</w:t>
+      </w:r>
+    </w:p>
+    <w:p>
+      <w:pPr>
+        <w:pStyle w:val="Heading2"/>
+        <w:rPr>
+          <w:rFonts w:eastAsia="Times New Roman"/>
+        </w:rPr>
+      </w:pPr>
+      <w:bookmarkStart w:id="8" w:name="_Toc236986556"/>
+      <w:r>
+        <w:rPr>
+          <w:rFonts w:eastAsia="Times New Roman"/>
+        </w:rPr>
+        <w:t>9. Seeing the mosaic</w:t>
+      </w:r>
+      <w:bookmarkEnd w:id="8"/>
+    </w:p>
+    <w:p>
+      <w:pPr>
+        <w:pStyle w:val="NormalWeb"/>
+        <w:spacing w:before="0" w:beforeAutospacing="0" w:after="60" w:afterAutospacing="0"/>
+      </w:pPr>
+      <w:r>
+        <w:t>The mosaic sits in the grid, so it is always on screen. Two ways to compare it with the photo:</w:t>
       </w:r>
     </w:p>
     <w:p>
@@ -3652,72 +3282,23 @@
       </w:pPr>
       <w:r>
         <w:rPr>
-          <w:i/>
-          <w:iCs/>
-        </w:rPr>
-        <w:t>Move a part</w:t>
-      </w:r>
-      <w:r>
-        <w:t xml:space="preserve"> — with a part selected, the arrow keys shift it one stud at a time. Its tiles and its outline travel together, so nothing is left behind at the old position, and a run of presses undoes in a single Ctrl-Z. A part stops at the edge of the plate, and it covers whatever it is moved onto.</w:t>
-      </w:r>
-    </w:p>
-    <w:p>
-      <w:pPr>
-        <w:pStyle w:val="NormalWeb"/>
-        <w:spacing w:before="0" w:beforeAutospacing="0" w:after="60" w:afterAutospacing="0"/>
-      </w:pPr>
-      <w:r>
-        <w:t>Parts are saved in the project and keep their names when it is reopened.</w:t>
-      </w:r>
-    </w:p>
-    <w:p>
-      <w:pPr>
-        <w:pStyle w:val="Heading2"/>
-        <w:rPr>
-          <w:rFonts w:eastAsia="Times New Roman"/>
-        </w:rPr>
-      </w:pPr>
-      <w:bookmarkStart w:id="11" w:name="_Toc236986559"/>
-      <w:r>
-        <w:rPr>
-          <w:rFonts w:eastAsia="Times New Roman"/>
-        </w:rPr>
-        <w:t>12. The tile list (bill of materials)</w:t>
-      </w:r>
-      <w:bookmarkEnd w:id="11"/>
-    </w:p>
-    <w:p>
-      <w:pPr>
-        <w:pStyle w:val="NormalWeb"/>
-        <w:spacing w:before="0" w:beforeAutospacing="0" w:after="60" w:afterAutospacing="0"/>
-      </w:pPr>
-      <w:r>
-        <w:t>After Build It!, the status line gives the headline — how many tiles in how many colors. Save → Tile List writes the full list as a text file: every color with its count, sorted most-used first, and the grand total. Print puts the same counts beneath the picture on the printed sheet (Section 13). Because Sangala builds only from the palette, every line is a color in it.</w:t>
-      </w:r>
-    </w:p>
-    <w:p>
-      <w:pPr>
-        <w:pStyle w:val="Heading2"/>
-        <w:rPr>
-          <w:rFonts w:eastAsia="Times New Roman"/>
-        </w:rPr>
-      </w:pPr>
-      <w:bookmarkStart w:id="12" w:name="_Toc236986560"/>
-      <w:r>
-        <w:rPr>
-          <w:rFonts w:eastAsia="Times New Roman"/>
-        </w:rPr>
-        <w:t>13. Saving and printing</w:t>
-      </w:r>
-      <w:bookmarkEnd w:id="12"/>
-    </w:p>
-    <w:p>
-      <w:pPr>
-        <w:pStyle w:val="NormalWeb"/>
-        <w:spacing w:before="0" w:beforeAutospacing="0" w:after="60" w:afterAutospacing="0"/>
-      </w:pPr>
-      <w:r>
-        <w:t>Work leaves the tool three ways: as a saved project, as an image or tile list, or as a printed sheet.</w:t>
+          <w:rStyle w:val="Strong"/>
+          <w:rFonts w:eastAsia="Times New Roman"/>
+        </w:rPr>
+        <w:t>Side by side</w:t>
+      </w:r>
+      <w:r>
+        <w:t xml:space="preserve"> — the workspace stays live, so </w:t>
+      </w:r>
+      <w:r>
+        <w:rPr>
+          <w:rStyle w:val="Strong"/>
+          <w:rFonts w:eastAsia="Times New Roman"/>
+        </w:rPr>
+        <w:t>Open</w:t>
+      </w:r>
+      <w:r>
+        <w:t xml:space="preserve"> a copy of the photo and drag it beside the mosaic; adding or moving it never disturbs the mosaic.</w:t>
       </w:r>
     </w:p>
     <w:p>
@@ -3738,47 +3319,595 @@
           <w:rStyle w:val="Strong"/>
           <w:rFonts w:eastAsia="Times New Roman"/>
         </w:rPr>
-        <w:t>Save your work</w:t>
-      </w:r>
-      <w:r>
-        <w:t xml:space="preserve"> — the </w:t>
-      </w:r>
+        <w:t xml:space="preserve">Transparent — make the tiles translucent so the photo </w:t>
+      </w:r>
+      <w:proofErr w:type="gramStart"/>
+      <w:r>
+        <w:rPr>
+          <w:rStyle w:val="Strong"/>
+          <w:rFonts w:eastAsia="Times New Roman"/>
+        </w:rPr>
+        <w:t>shows through</w:t>
+      </w:r>
+      <w:proofErr w:type="gramEnd"/>
+      <w:r>
+        <w:rPr>
+          <w:rStyle w:val="Strong"/>
+          <w:rFonts w:eastAsia="Times New Roman"/>
+        </w:rPr>
+        <w:t xml:space="preserve"> underneath. It </w:t>
+      </w:r>
+      <w:proofErr w:type="gramStart"/>
+      <w:r>
+        <w:rPr>
+          <w:rStyle w:val="Strong"/>
+          <w:rFonts w:eastAsia="Times New Roman"/>
+        </w:rPr>
+        <w:t>stays</w:t>
+      </w:r>
+      <w:proofErr w:type="gramEnd"/>
+      <w:r>
+        <w:rPr>
+          <w:rStyle w:val="Strong"/>
+          <w:rFonts w:eastAsia="Times New Roman"/>
+        </w:rPr>
+        <w:t xml:space="preserve"> available while painting (Section 10). The Transparency slider (in Adjust Mosaic, shown while Transparent is on) sets how much photo shows through; the setting saves with the project.</w:t>
+      </w:r>
+    </w:p>
+    <w:p>
+      <w:pPr>
+        <w:keepNext/>
+        <w:spacing w:before="120"/>
+        <w:jc w:val="center"/>
+      </w:pPr>
+      <w:r>
+        <w:rPr>
+          <w:noProof/>
+        </w:rPr>
+        <w:drawing>
+          <wp:inline distT="0" distB="0" distL="0" distR="0" wp14:anchorId="7429AC2A" wp14:editId="7DBECAAE">
+            <wp:extent cx="3017520" cy="2984464"/>
+            <wp:effectExtent l="0" t="0" r="0" b="0"/>
+            <wp:docPr id="1004" name="Figure4"/>
+            <wp:cNvGraphicFramePr>
+              <a:graphicFrameLocks xmlns:a="http://schemas.openxmlformats.org/drawingml/2006/main" noChangeAspect="1"/>
+            </wp:cNvGraphicFramePr>
+            <a:graphic xmlns:a="http://schemas.openxmlformats.org/drawingml/2006/main">
+              <a:graphicData uri="http://schemas.openxmlformats.org/drawingml/2006/picture">
+                <pic:pic xmlns:pic="http://schemas.openxmlformats.org/drawingml/2006/picture">
+                  <pic:nvPicPr>
+                    <pic:cNvPr id="1004" name="Figure4.png"/>
+                    <pic:cNvPicPr/>
+                  </pic:nvPicPr>
+                  <pic:blipFill>
+                    <a:blip r:embed="rId17"/>
+                    <a:stretch>
+                      <a:fillRect/>
+                    </a:stretch>
+                  </pic:blipFill>
+                  <pic:spPr>
+                    <a:xfrm>
+                      <a:off x="0" y="0"/>
+                      <a:ext cx="3017520" cy="2984464"/>
+                    </a:xfrm>
+                    <a:prstGeom prst="rect">
+                      <a:avLst/>
+                    </a:prstGeom>
+                  </pic:spPr>
+                </pic:pic>
+              </a:graphicData>
+            </a:graphic>
+          </wp:inline>
+        </w:drawing>
+      </w:r>
+    </w:p>
+    <w:p>
+      <w:pPr>
+        <w:spacing w:before="60" w:after="120"/>
+        <w:jc w:val="center"/>
+      </w:pPr>
       <w:r>
         <w:rPr>
           <w:i/>
           <w:iCs/>
         </w:rPr>
-        <w:t>Save</w:t>
-      </w:r>
-      <w:r>
-        <w:t xml:space="preserve"> button gives a choice. </w:t>
+        <w:t>Figure 8.</w:t>
       </w:r>
       <w:r>
         <w:rPr>
           <w:i/>
           <w:iCs/>
         </w:rPr>
-        <w:t>Project</w:t>
-      </w:r>
-      <w:r>
-        <w:t xml:space="preserve"> saves everything as a .mosaic file — your photos, the grid, your palette, your parts, and the built mosaic — so you can reopen it later and keep editing, and you choose where it goes. </w:t>
-      </w:r>
+        <w:t xml:space="preserve"> Transparent makes the tiles translucent so the photo shows through.</w:t>
+      </w:r>
+    </w:p>
+    <w:p>
+      <w:pPr>
+        <w:pStyle w:val="Heading2"/>
+        <w:rPr>
+          <w:rFonts w:eastAsia="Times New Roman"/>
+        </w:rPr>
+      </w:pPr>
+      <w:bookmarkStart w:id="9" w:name="_Toc236986557"/>
+      <w:r>
+        <w:rPr>
+          <w:rFonts w:eastAsia="Times New Roman"/>
+        </w:rPr>
+        <w:t>10. Editing tiles by hand: Paint, Pick, Erase</w:t>
+      </w:r>
+      <w:bookmarkEnd w:id="9"/>
+    </w:p>
+    <w:p>
+      <w:pPr>
+        <w:pStyle w:val="NormalWeb"/>
+        <w:spacing w:before="0" w:beforeAutospacing="0" w:after="60" w:afterAutospacing="0"/>
+      </w:pPr>
+      <w:r>
+        <w:t>Three tools on the left rail edit individual cells. They do not wait for a build: choosing one with nothing open starts an empty mosaic at the current grid size, so a design can be drawn tile by tile from the beginning. When to start a mosaic is your decision, not the program's.</w:t>
+      </w:r>
+    </w:p>
+    <w:p>
+      <w:pPr>
+        <w:pStyle w:val="ListParagraph"/>
+        <w:numPr>
+          <w:ilvl w:val="0"/>
+          <w:numId w:val="19"/>
+        </w:numPr>
+        <w:spacing w:after="60"/>
+        <w:contextualSpacing w:val="0"/>
+        <w:rPr>
+          <w:rFonts w:eastAsia="Times New Roman"/>
+        </w:rPr>
+      </w:pPr>
+      <w:r>
+        <w:rPr>
+          <w:rStyle w:val="Strong"/>
+          <w:rFonts w:eastAsia="Times New Roman"/>
+        </w:rPr>
+        <w:lastRenderedPageBreak/>
+        <w:t>Paint</w:t>
+      </w:r>
+      <w:r>
+        <w:t xml:space="preserve"> — click a color in the palette, then click or drag across cells to set them to that color. Hold Shift to erase instead, and release it to paint again, so a correction in the middle of a stroke needs no trip back to the tool rail. Right-click a cell to clear it.</w:t>
+      </w:r>
+    </w:p>
+    <w:p>
+      <w:pPr>
+        <w:pStyle w:val="ListParagraph"/>
+        <w:numPr>
+          <w:ilvl w:val="0"/>
+          <w:numId w:val="19"/>
+        </w:numPr>
+        <w:spacing w:after="60"/>
+        <w:contextualSpacing w:val="0"/>
+        <w:rPr>
+          <w:rFonts w:eastAsia="Times New Roman"/>
+        </w:rPr>
+      </w:pPr>
+      <w:r>
+        <w:rPr>
+          <w:rStyle w:val="Strong"/>
+          <w:rFonts w:eastAsia="Times New Roman"/>
+        </w:rPr>
+        <w:t>Pick</w:t>
+      </w:r>
+      <w:r>
+        <w:t xml:space="preserve"> — click a cell to grab its color, then keep painting with it.</w:t>
+      </w:r>
+    </w:p>
+    <w:p>
+      <w:pPr>
+        <w:pStyle w:val="ListParagraph"/>
+        <w:numPr>
+          <w:ilvl w:val="0"/>
+          <w:numId w:val="19"/>
+        </w:numPr>
+        <w:spacing w:after="60"/>
+        <w:contextualSpacing w:val="0"/>
+        <w:rPr>
+          <w:rFonts w:eastAsia="Times New Roman"/>
+        </w:rPr>
+      </w:pPr>
+      <w:r>
+        <w:rPr>
+          <w:rStyle w:val="Strong"/>
+          <w:rFonts w:eastAsia="Times New Roman"/>
+        </w:rPr>
+        <w:t>Erase</w:t>
+      </w:r>
+      <w:r>
+        <w:t xml:space="preserve"> — click or drag to clear cells back to empty (the baseplate shows through).</w:t>
+      </w:r>
+    </w:p>
+    <w:p>
+      <w:pPr>
+        <w:pStyle w:val="NormalWeb"/>
+        <w:spacing w:beforeAutospacing="0" w:afterAutospacing="0"/>
+      </w:pPr>
       <w:r>
         <w:rPr>
           <w:i/>
           <w:iCs/>
         </w:rPr>
-        <w:t>Image</w:t>
-      </w:r>
-      <w:r>
-        <w:t xml:space="preserve"> saves a picture of the mosaic as a .png or .jpg.</w:t>
+        <w:t>Undo is there.</w:t>
+      </w:r>
+      <w:r>
+        <w:t xml:space="preserve"> </w:t>
       </w:r>
       <w:r>
         <w:rPr>
           <w:i/>
           <w:iCs/>
         </w:rPr>
-        <w:t>Tile List</w:t>
+        <w:t>Ctrl-Z</w:t>
+      </w:r>
+      <w:r>
+        <w:t xml:space="preserve"> undoes your last stroke — a whole dragged line comes back in one press — and </w:t>
+      </w:r>
+      <w:r>
+        <w:rPr>
+          <w:i/>
+          <w:iCs/>
+        </w:rPr>
+        <w:t>Ctrl-Y</w:t>
+      </w:r>
+      <w:r>
+        <w:t xml:space="preserve"> (or </w:t>
+      </w:r>
+      <w:r>
+        <w:rPr>
+          <w:i/>
+          <w:iCs/>
+        </w:rPr>
+        <w:t>Ctrl-Shift-Z</w:t>
+      </w:r>
+      <w:r>
+        <w:t>) redoes it. Changing the grid size is a single step of its own, so that too can be undone. Building again over the photo replaces what is there, as does changing the photo itself.</w:t>
+      </w:r>
+    </w:p>
+    <w:p>
+      <w:pPr>
+        <w:pStyle w:val="Heading2"/>
+        <w:rPr>
+          <w:rFonts w:eastAsia="Times New Roman"/>
+        </w:rPr>
+      </w:pPr>
+      <w:bookmarkStart w:id="10" w:name="_Toc236986558"/>
+      <w:r>
+        <w:rPr>
+          <w:rFonts w:eastAsia="Times New Roman"/>
+        </w:rPr>
+        <w:t>11. Grouping tiles into parts</w:t>
+      </w:r>
+      <w:bookmarkEnd w:id="10"/>
+    </w:p>
+    <w:p>
+      <w:pPr>
+        <w:pStyle w:val="NormalWeb"/>
+        <w:spacing w:before="0" w:beforeAutospacing="0" w:after="60" w:afterAutospacing="0"/>
+      </w:pPr>
+      <w:r>
+        <w:t xml:space="preserve">Any group of tiles — a head, a leg, any region — can be selected and assigned a name. After a build, select tiles and </w:t>
+      </w:r>
+      <w:r>
+        <w:rPr>
+          <w:i/>
+          <w:iCs/>
+        </w:rPr>
+        <w:t>Group</w:t>
+      </w:r>
+      <w:r>
+        <w:t xml:space="preserve"> them:</w:t>
+      </w:r>
+    </w:p>
+    <w:p>
+      <w:pPr>
+        <w:pStyle w:val="ListParagraph"/>
+        <w:numPr>
+          <w:ilvl w:val="0"/>
+          <w:numId w:val="19"/>
+        </w:numPr>
+        <w:spacing w:after="60"/>
+        <w:contextualSpacing w:val="0"/>
+        <w:rPr>
+          <w:rFonts w:eastAsia="Times New Roman"/>
+        </w:rPr>
+      </w:pPr>
+      <w:r>
+        <w:rPr>
+          <w:i/>
+          <w:iCs/>
+        </w:rPr>
+        <w:t>Select Area</w:t>
+      </w:r>
+      <w:r>
+        <w:t xml:space="preserve"> — drag a box to select the tiles inside it, whatever color they are.</w:t>
+      </w:r>
+    </w:p>
+    <w:p>
+      <w:pPr>
+        <w:pStyle w:val="ListParagraph"/>
+        <w:numPr>
+          <w:ilvl w:val="0"/>
+          <w:numId w:val="19"/>
+        </w:numPr>
+        <w:spacing w:after="60"/>
+        <w:contextualSpacing w:val="0"/>
+        <w:rPr>
+          <w:rFonts w:eastAsia="Times New Roman"/>
+        </w:rPr>
+      </w:pPr>
+      <w:r>
+        <w:rPr>
+          <w:i/>
+          <w:iCs/>
+        </w:rPr>
+        <w:t>Wand</w:t>
+      </w:r>
+      <w:r>
+        <w:t xml:space="preserve"> — click a tile to select the whole connected run of that color. The </w:t>
+      </w:r>
+      <w:r>
+        <w:rPr>
+          <w:i/>
+          <w:iCs/>
+        </w:rPr>
+        <w:t>Similar Colors</w:t>
+      </w:r>
+      <w:r>
+        <w:t xml:space="preserve"> slider (shown while the Wand is active) lets nearby colors join the run — at 0, only the exact color; moving it re-grows the last clicked run.</w:t>
+      </w:r>
+    </w:p>
+    <w:p>
+      <w:pPr>
+        <w:pStyle w:val="ListParagraph"/>
+        <w:numPr>
+          <w:ilvl w:val="0"/>
+          <w:numId w:val="19"/>
+        </w:numPr>
+        <w:spacing w:after="60"/>
+        <w:contextualSpacing w:val="0"/>
+        <w:rPr>
+          <w:rFonts w:eastAsia="Times New Roman"/>
+        </w:rPr>
+      </w:pPr>
+      <w:r>
+        <w:rPr>
+          <w:i/>
+          <w:iCs/>
+        </w:rPr>
+        <w:t>Shift</w:t>
+      </w:r>
+      <w:r>
+        <w:t xml:space="preserve">-click adds or drops a single tile; </w:t>
+      </w:r>
+      <w:r>
+        <w:rPr>
+          <w:i/>
+          <w:iCs/>
+        </w:rPr>
+        <w:t>Alt</w:t>
+      </w:r>
+      <w:r>
+        <w:t xml:space="preserve"> removes; </w:t>
+      </w:r>
+      <w:r>
+        <w:rPr>
+          <w:i/>
+          <w:iCs/>
+        </w:rPr>
+        <w:t>Ctrl-D</w:t>
+      </w:r>
+      <w:r>
+        <w:t xml:space="preserve"> deselects. The three selection tools all feed one selection, so mix them freely.</w:t>
+      </w:r>
+    </w:p>
+    <w:p>
+      <w:pPr>
+        <w:pStyle w:val="ListParagraph"/>
+        <w:numPr>
+          <w:ilvl w:val="0"/>
+          <w:numId w:val="19"/>
+        </w:numPr>
+        <w:spacing w:after="60"/>
+        <w:contextualSpacing w:val="0"/>
+        <w:rPr>
+          <w:rFonts w:eastAsia="Times New Roman"/>
+        </w:rPr>
+      </w:pPr>
+      <w:r>
+        <w:rPr>
+          <w:i/>
+          <w:iCs/>
+        </w:rPr>
+        <w:t>Group</w:t>
+      </w:r>
+      <w:r>
+        <w:t xml:space="preserve"> turns the selection into a named part. </w:t>
+      </w:r>
+      <w:r>
+        <w:rPr>
+          <w:i/>
+          <w:iCs/>
+        </w:rPr>
+        <w:t>Select</w:t>
+      </w:r>
+      <w:r>
+        <w:t xml:space="preserve"> (the arrow) reselects a part with one click; change its tiles and the button reads </w:t>
+      </w:r>
+      <w:r>
+        <w:rPr>
+          <w:i/>
+          <w:iCs/>
+        </w:rPr>
+        <w:t>Update Part</w:t>
+      </w:r>
+      <w:r>
+        <w:t xml:space="preserve"> — press it to keep the change.</w:t>
+      </w:r>
+    </w:p>
+    <w:p>
+      <w:pPr>
+        <w:pStyle w:val="ListParagraph"/>
+        <w:numPr>
+          <w:ilvl w:val="0"/>
+          <w:numId w:val="19"/>
+        </w:numPr>
+        <w:spacing w:after="60"/>
+        <w:contextualSpacing w:val="0"/>
+        <w:rPr>
+          <w:rFonts w:eastAsia="Times New Roman"/>
+        </w:rPr>
+      </w:pPr>
+      <w:r>
+        <w:rPr>
+          <w:i/>
+          <w:iCs/>
+        </w:rPr>
+        <w:t>Move a part</w:t>
+      </w:r>
+      <w:r>
+        <w:t xml:space="preserve"> — with a part selected, the arrow keys shift it one stud at a time. Its tiles and its outline travel together, so nothing is left behind at the old position, and a run of presses undoes in a single Ctrl-Z. A part stops at the edge of the plate, and it covers whatever it is moved onto.</w:t>
+      </w:r>
+    </w:p>
+    <w:p>
+      <w:pPr>
+        <w:pStyle w:val="NormalWeb"/>
+        <w:spacing w:before="0" w:beforeAutospacing="0" w:after="60" w:afterAutospacing="0"/>
+      </w:pPr>
+      <w:r>
+        <w:t>Parts are saved in the project and keep their names when it is reopened.</w:t>
+      </w:r>
+    </w:p>
+    <w:p>
+      <w:pPr>
+        <w:pStyle w:val="Heading2"/>
+        <w:rPr>
+          <w:rFonts w:eastAsia="Times New Roman"/>
+        </w:rPr>
+      </w:pPr>
+      <w:bookmarkStart w:id="11" w:name="_Toc236986559"/>
+      <w:r>
+        <w:rPr>
+          <w:rFonts w:eastAsia="Times New Roman"/>
+        </w:rPr>
+        <w:t>12. The tile list (bill of materials)</w:t>
+      </w:r>
+      <w:bookmarkEnd w:id="11"/>
+    </w:p>
+    <w:p>
+      <w:pPr>
+        <w:pStyle w:val="NormalWeb"/>
+        <w:spacing w:before="0" w:beforeAutospacing="0" w:after="60" w:afterAutospacing="0"/>
+      </w:pPr>
+      <w:r>
+        <w:t>After Build It!, the status line gives the headline — how many tiles in how many colors. Save → Tile List writes the full list as a text file: every color with its count, sorted most-used first, and the grand total. Print puts the same counts beneath the picture on the printed sheet (Section 13). Because Sangala builds only from the palette, every line is a color in it.</w:t>
+      </w:r>
+    </w:p>
+    <w:p>
+      <w:pPr>
+        <w:pStyle w:val="Heading2"/>
+        <w:rPr>
+          <w:rFonts w:eastAsia="Times New Roman"/>
+        </w:rPr>
+      </w:pPr>
+      <w:bookmarkStart w:id="12" w:name="_Toc236986560"/>
+      <w:r>
+        <w:rPr>
+          <w:rFonts w:eastAsia="Times New Roman"/>
+        </w:rPr>
+        <w:t>13. Saving and printing</w:t>
+      </w:r>
+      <w:bookmarkEnd w:id="12"/>
+    </w:p>
+    <w:p>
+      <w:pPr>
+        <w:pStyle w:val="NormalWeb"/>
+        <w:spacing w:before="0" w:beforeAutospacing="0" w:after="60" w:afterAutospacing="0"/>
+      </w:pPr>
+      <w:r>
+        <w:t>Work leaves the tool three ways: as a saved project, as an image or tile list, or as a printed sheet.</w:t>
+      </w:r>
+    </w:p>
+    <w:p>
+      <w:pPr>
+        <w:pStyle w:val="ListParagraph"/>
+        <w:numPr>
+          <w:ilvl w:val="0"/>
+          <w:numId w:val="19"/>
+        </w:numPr>
+        <w:spacing w:after="60"/>
+        <w:contextualSpacing w:val="0"/>
+        <w:rPr>
+          <w:rFonts w:eastAsia="Times New Roman"/>
+        </w:rPr>
+      </w:pPr>
+      <w:r>
+        <w:rPr>
+          <w:rStyle w:val="Strong"/>
+          <w:rFonts w:eastAsia="Times New Roman"/>
+        </w:rPr>
+        <w:t>Save your work</w:t>
+      </w:r>
+      <w:r>
+        <w:t xml:space="preserve"> — the </w:t>
+      </w:r>
+      <w:r>
+        <w:rPr>
+          <w:i/>
+          <w:iCs/>
+        </w:rPr>
+        <w:t>Save</w:t>
+      </w:r>
+      <w:r>
+        <w:t xml:space="preserve"> button gives a choice. </w:t>
+      </w:r>
+      <w:r>
+        <w:rPr>
+          <w:i/>
+          <w:iCs/>
+        </w:rPr>
+        <w:t>Project</w:t>
+      </w:r>
+      <w:r>
+        <w:t xml:space="preserve"> saves everything as a .mosaic file — your photos, the grid, your palette, your parts, and the built mosaic — so you can reopen it later and keep editing, and you choose where it goes. </w:t>
+      </w:r>
+      <w:r>
+        <w:rPr>
+          <w:i/>
+          <w:iCs/>
+        </w:rPr>
+        <w:t>Image</w:t>
+      </w:r>
+      <w:r>
+        <w:t xml:space="preserve"> saves a picture of the mosaic as a .</w:t>
+      </w:r>
+      <w:proofErr w:type="spellStart"/>
+      <w:r>
+        <w:t>png</w:t>
+      </w:r>
+      <w:proofErr w:type="spellEnd"/>
+      <w:r>
+        <w:t xml:space="preserve"> or .</w:t>
+      </w:r>
+      <w:proofErr w:type="spellStart"/>
+      <w:r>
+        <w:t>jpg.</w:t>
+      </w:r>
+      <w:r>
+        <w:rPr>
+          <w:i/>
+          <w:iCs/>
+        </w:rPr>
+        <w:t>Tile</w:t>
+      </w:r>
+      <w:proofErr w:type="spellEnd"/>
+      <w:r>
+        <w:rPr>
+          <w:i/>
+          <w:iCs/>
+        </w:rPr>
+        <w:t xml:space="preserve"> List</w:t>
       </w:r>
       <w:r>
         <w:t xml:space="preserve"> saves the tile counts by color as a .txt — the list to order from or build against.</w:t>
@@ -5004,7 +5133,25 @@
                 <w:sz w:val="20"/>
                 <w:szCs w:val="20"/>
               </w:rPr>
-              <w:t>Save → Project (.mosaic), Image (.png / .jpg), or Tile List (.txt)</w:t>
+              <w:t>Save → Project (.mosaic), Image (.</w:t>
+            </w:r>
+            <w:proofErr w:type="spellStart"/>
+            <w:r>
+              <w:rPr>
+                <w:rFonts w:ascii="Arial" w:eastAsia="Times New Roman" w:hAnsi="Arial" w:cs="Arial"/>
+                <w:sz w:val="20"/>
+                <w:szCs w:val="20"/>
+              </w:rPr>
+              <w:t>png</w:t>
+            </w:r>
+            <w:proofErr w:type="spellEnd"/>
+            <w:r>
+              <w:rPr>
+                <w:rFonts w:ascii="Arial" w:eastAsia="Times New Roman" w:hAnsi="Arial" w:cs="Arial"/>
+                <w:sz w:val="20"/>
+                <w:szCs w:val="20"/>
+              </w:rPr>
+              <w:t xml:space="preserve"> / .jpg), or Tile List (.txt)</w:t>
             </w:r>
           </w:p>
         </w:tc>
@@ -5712,7 +5859,7 @@
       </w:pPr>
     </w:p>
     <w:sectPr>
-      <w:footerReference w:type="default" r:id="rId14"/>
+      <w:footerReference w:type="default" r:id="rId18"/>
       <w:pgSz w:w="12240" w:h="15840"/>
       <w:pgMar w:top="1440" w:right="1530" w:bottom="1440" w:left="1440" w:header="720" w:footer="720" w:gutter="0"/>
       <w:pgNumType w:start="1"/>
@@ -5797,6 +5944,16 @@
 
 <file path=word/footer2.xml><?xml version="1.0" encoding="utf-8"?>
 <w:ftr xmlns:wpc="http://schemas.microsoft.com/office/word/2010/wordprocessingCanvas" xmlns:cx="http://schemas.microsoft.com/office/drawing/2014/chartex" xmlns:cx1="http://schemas.microsoft.com/office/drawing/2015/9/8/chartex" xmlns:cx2="http://schemas.microsoft.com/office/drawing/2015/10/21/chartex" xmlns:cx3="http://schemas.microsoft.com/office/drawing/2016/5/9/chartex" xmlns:cx4="http://schemas.microsoft.com/office/drawing/2016/5/10/chartex" xmlns:cx5="http://schemas.microsoft.com/office/drawing/2016/5/11/chartex" xmlns:cx6="http://schemas.microsoft.com/office/drawing/2016/5/12/chartex" xmlns:cx7="http://schemas.microsoft.com/office/drawing/2016/5/13/chartex" xmlns:cx8="http://schemas.microsoft.com/office/drawing/2016/5/14/chartex" xmlns:mc="http://schemas.openxmlformats.org/markup-compatibility/2006" xmlns:aink="http://schemas.microsoft.com/office/drawing/2016/ink" xmlns:am3d="http://schemas.microsoft.com/office/drawing/2017/model3d" xmlns:o="urn:schemas-microsoft-com:office:office" xmlns:oel="http://schemas.microsoft.com/office/2019/extlst" xmlns:r="http://schemas.openxmlformats.org/officeDocument/2006/relationships" xmlns:m="http://schemas.openxmlformats.org/officeDocument/2006/math" xmlns:v="urn:schemas-microsoft-com:vml" xmlns:wp14="http://schemas.microsoft.com/office/word/2010/wordprocessingDrawing" xmlns:wp="http://schemas.openxmlformats.org/drawingml/2006/wordprocessingDrawing" xmlns:w10="urn:schemas-microsoft-com:office:word" xmlns:w="http://schemas.openxmlformats.org/wordprocessingml/2006/main" xmlns:w14="http://schemas.microsoft.com/office/word/2010/wordml" xmlns:w15="http://schemas.microsoft.com/office/word/2012/wordml" xmlns:w16cei="http://schemas.microsoft.com/office/word/2026/wordml/cei" xmlns:w16cex="http://schemas.microsoft.com/office/word/2018/wordml/cex" xmlns:w16cid="http://schemas.microsoft.com/office/word/2016/wordml/cid" xmlns:w16="http://schemas.microsoft.com/office/word/2018/wordml" xmlns:w16du="http://schemas.microsoft.com/office/word/2023/wordml/word16du" xmlns:w16sdtdh="http://schemas.microsoft.com/office/word/2020/wordml/sdtdatahash" xmlns:w16sdtfl="http://schemas.microsoft.com/office/word/2024/wordml/sdtformatlock" xmlns:w16se="http://schemas.microsoft.com/office/word/2015/wordml/symex" xmlns:wpg="http://schemas.microsoft.com/office/word/2010/wordprocessingGroup" xmlns:wpi="http://schemas.microsoft.com/office/word/2010/wordprocessingInk" xmlns:wne="http://schemas.microsoft.com/office/word/2006/wordml" xmlns:wps="http://schemas.microsoft.com/office/word/2010/wordprocessingShape" mc:Ignorable="w14 w15 w16se w16cid w16 w16cex w16sdtdh w16sdtfl w16du wp14">
+  <w:p>
+    <w:pPr>
+      <w:pStyle w:val="Footer"/>
+    </w:pPr>
+  </w:p>
+</w:ftr>
+</file>
+
+<file path=word/footer3.xml><?xml version="1.0" encoding="utf-8"?>
+<w:ftr xmlns:wpc="http://schemas.microsoft.com/office/word/2010/wordprocessingCanvas" xmlns:cx="http://schemas.microsoft.com/office/drawing/2014/chartex" xmlns:cx1="http://schemas.microsoft.com/office/drawing/2015/9/8/chartex" xmlns:cx2="http://schemas.microsoft.com/office/drawing/2015/10/21/chartex" xmlns:cx3="http://schemas.microsoft.com/office/drawing/2016/5/9/chartex" xmlns:cx4="http://schemas.microsoft.com/office/drawing/2016/5/10/chartex" xmlns:cx5="http://schemas.microsoft.com/office/drawing/2016/5/11/chartex" xmlns:cx6="http://schemas.microsoft.com/office/drawing/2016/5/12/chartex" xmlns:cx7="http://schemas.microsoft.com/office/drawing/2016/5/13/chartex" xmlns:cx8="http://schemas.microsoft.com/office/drawing/2016/5/14/chartex" xmlns:mc="http://schemas.openxmlformats.org/markup-compatibility/2006" xmlns:aink="http://schemas.microsoft.com/office/drawing/2016/ink" xmlns:am3d="http://schemas.microsoft.com/office/drawing/2017/model3d" xmlns:o="urn:schemas-microsoft-com:office:office" xmlns:oel="http://schemas.microsoft.com/office/2019/extlst" xmlns:r="http://schemas.openxmlformats.org/officeDocument/2006/relationships" xmlns:m="http://schemas.openxmlformats.org/officeDocument/2006/math" xmlns:v="urn:schemas-microsoft-com:vml" xmlns:wp14="http://schemas.microsoft.com/office/word/2010/wordprocessingDrawing" xmlns:wp="http://schemas.openxmlformats.org/drawingml/2006/wordprocessingDrawing" xmlns:w10="urn:schemas-microsoft-com:office:word" xmlns:w="http://schemas.openxmlformats.org/wordprocessingml/2006/main" xmlns:w14="http://schemas.microsoft.com/office/word/2010/wordml" xmlns:w15="http://schemas.microsoft.com/office/word/2012/wordml" xmlns:w16cei="http://schemas.microsoft.com/office/word/2026/wordml/cei" xmlns:w16cex="http://schemas.microsoft.com/office/word/2018/wordml/cex" xmlns:w16cid="http://schemas.microsoft.com/office/word/2016/wordml/cid" xmlns:w16="http://schemas.microsoft.com/office/word/2018/wordml" xmlns:w16du="http://schemas.microsoft.com/office/word/2023/wordml/word16du" xmlns:w16sdtdh="http://schemas.microsoft.com/office/word/2020/wordml/sdtdatahash" xmlns:w16sdtfl="http://schemas.microsoft.com/office/word/2024/wordml/sdtformatlock" xmlns:w16se="http://schemas.microsoft.com/office/word/2015/wordml/symex" xmlns:wpg="http://schemas.microsoft.com/office/word/2010/wordprocessingGroup" xmlns:wpi="http://schemas.microsoft.com/office/word/2010/wordprocessingInk" xmlns:wne="http://schemas.microsoft.com/office/word/2006/wordml" xmlns:wps="http://schemas.microsoft.com/office/word/2010/wordprocessingShape" mc:Ignorable="w14 w15 w16se w16cid w16 w16cex w16sdtdh w16sdtfl w16du wp14">
   <w:sdt>
     <w:sdtPr>
       <w:id w:val="-1844781770"/>
@@ -5840,16 +5997,6 @@
       </w:p>
     </w:sdtContent>
   </w:sdt>
-  <w:p>
-    <w:pPr>
-      <w:pStyle w:val="Footer"/>
-    </w:pPr>
-  </w:p>
-</w:ftr>
-</file>
-
-<file path=word/footer3.xml><?xml version="1.0" encoding="utf-8"?>
-<w:ftr xmlns:wpc="http://schemas.microsoft.com/office/word/2010/wordprocessingCanvas" xmlns:cx="http://schemas.microsoft.com/office/drawing/2014/chartex" xmlns:cx1="http://schemas.microsoft.com/office/drawing/2015/9/8/chartex" xmlns:cx2="http://schemas.microsoft.com/office/drawing/2015/10/21/chartex" xmlns:cx3="http://schemas.microsoft.com/office/drawing/2016/5/9/chartex" xmlns:cx4="http://schemas.microsoft.com/office/drawing/2016/5/10/chartex" xmlns:cx5="http://schemas.microsoft.com/office/drawing/2016/5/11/chartex" xmlns:cx6="http://schemas.microsoft.com/office/drawing/2016/5/12/chartex" xmlns:cx7="http://schemas.microsoft.com/office/drawing/2016/5/13/chartex" xmlns:cx8="http://schemas.microsoft.com/office/drawing/2016/5/14/chartex" xmlns:mc="http://schemas.openxmlformats.org/markup-compatibility/2006" xmlns:aink="http://schemas.microsoft.com/office/drawing/2016/ink" xmlns:am3d="http://schemas.microsoft.com/office/drawing/2017/model3d" xmlns:o="urn:schemas-microsoft-com:office:office" xmlns:oel="http://schemas.microsoft.com/office/2019/extlst" xmlns:r="http://schemas.openxmlformats.org/officeDocument/2006/relationships" xmlns:m="http://schemas.openxmlformats.org/officeDocument/2006/math" xmlns:v="urn:schemas-microsoft-com:vml" xmlns:wp14="http://schemas.microsoft.com/office/word/2010/wordprocessingDrawing" xmlns:wp="http://schemas.openxmlformats.org/drawingml/2006/wordprocessingDrawing" xmlns:w10="urn:schemas-microsoft-com:office:word" xmlns:w="http://schemas.openxmlformats.org/wordprocessingml/2006/main" xmlns:w14="http://schemas.microsoft.com/office/word/2010/wordml" xmlns:w15="http://schemas.microsoft.com/office/word/2012/wordml" xmlns:w16cei="http://schemas.microsoft.com/office/word/2026/wordml/cei" xmlns:w16cex="http://schemas.microsoft.com/office/word/2018/wordml/cex" xmlns:w16cid="http://schemas.microsoft.com/office/word/2016/wordml/cid" xmlns:w16="http://schemas.microsoft.com/office/word/2018/wordml" xmlns:w16du="http://schemas.microsoft.com/office/word/2023/wordml/word16du" xmlns:w16sdtdh="http://schemas.microsoft.com/office/word/2020/wordml/sdtdatahash" xmlns:w16sdtfl="http://schemas.microsoft.com/office/word/2024/wordml/sdtformatlock" xmlns:w16se="http://schemas.microsoft.com/office/word/2015/wordml/symex" xmlns:wpg="http://schemas.microsoft.com/office/word/2010/wordprocessingGroup" xmlns:wpi="http://schemas.microsoft.com/office/word/2010/wordprocessingInk" xmlns:wne="http://schemas.microsoft.com/office/word/2006/wordml" xmlns:wps="http://schemas.microsoft.com/office/word/2010/wordprocessingShape" mc:Ignorable="w14 w15 w16se w16cid w16 w16cex w16sdtdh w16sdtfl w16du wp14">
   <w:p>
     <w:pPr>
       <w:pStyle w:val="Footer"/>
@@ -8959,6 +9106,18 @@
       <w:u w:val="single"/>
     </w:rPr>
   </w:style>
+  <w:style w:type="paragraph" w:styleId="Revision">
+    <w:name w:val="Revision"/>
+    <w:hidden/>
+    <w:uiPriority w:val="99"/>
+    <w:semiHidden/>
+    <w:rsid w:val="004D0C84"/>
+    <w:rPr>
+      <w:rFonts w:eastAsiaTheme="minorEastAsia"/>
+      <w:sz w:val="22"/>
+      <w:szCs w:val="24"/>
+    </w:rPr>
+  </w:style>
 </w:styles>
 </file>
 

</xml_diff>